<commit_message>
README.txt information about folders
</commit_message>
<xml_diff>
--- a/dokumentace/Dokumentace.docx
+++ b/dokumentace/Dokumentace.docx
@@ -77,6 +77,1261 @@
             <w:t>Nela Haasová</w:t>
           </w:r>
         </w:p>
+        <w:p/>
+        <w:p>
+          <w:pPr>
+            <w:ind w:firstLine="0"/>
+          </w:pPr>
+          <w:r>
+            <w:br w:type="page"/>
+          </w:r>
+        </w:p>
+        <w:sdt>
+          <w:sdtPr>
+            <w:id w:val="-1852559373"/>
+            <w:docPartObj>
+              <w:docPartGallery w:val="Table of Contents"/>
+              <w:docPartUnique/>
+            </w:docPartObj>
+          </w:sdtPr>
+          <w:sdtEndPr>
+            <w:rPr>
+              <w:rFonts w:ascii="Times New Roman" w:eastAsiaTheme="minorHAnsi" w:hAnsi="Times New Roman" w:cstheme="minorBidi"/>
+              <w:b/>
+              <w:bCs/>
+              <w:color w:val="auto"/>
+              <w:kern w:val="2"/>
+              <w:sz w:val="24"/>
+              <w:szCs w:val="24"/>
+              <w:lang w:val="cs-CZ" w:eastAsia="en-US"/>
+              <w14:ligatures w14:val="standardContextual"/>
+            </w:rPr>
+          </w:sdtEndPr>
+          <w:sdtContent>
+            <w:p>
+              <w:pPr>
+                <w:pStyle w:val="TOCHeading"/>
+              </w:pPr>
+              <w:proofErr w:type="spellStart"/>
+              <w:r>
+                <w:t>Obsah</w:t>
+              </w:r>
+              <w:proofErr w:type="spellEnd"/>
+            </w:p>
+            <w:p>
+              <w:pPr>
+                <w:pStyle w:val="TOC1"/>
+                <w:tabs>
+                  <w:tab w:val="left" w:pos="1200"/>
+                  <w:tab w:val="right" w:leader="dot" w:pos="9016"/>
+                </w:tabs>
+                <w:rPr>
+                  <w:rFonts w:asciiTheme="minorHAnsi" w:eastAsiaTheme="minorEastAsia" w:hAnsiTheme="minorHAnsi"/>
+                  <w:noProof/>
+                  <w:lang w:val="en-GB" w:eastAsia="en-GB"/>
+                </w:rPr>
+              </w:pPr>
+              <w:r>
+                <w:fldChar w:fldCharType="begin"/>
+              </w:r>
+              <w:r>
+                <w:instrText xml:space="preserve"> TOC \o "1-3" \h \z \u </w:instrText>
+              </w:r>
+              <w:r>
+                <w:fldChar w:fldCharType="separate"/>
+              </w:r>
+              <w:hyperlink w:anchor="_Toc229437719" w:history="1">
+                <w:r>
+                  <w:rPr>
+                    <w:rStyle w:val="Hyperlink"/>
+                    <w:noProof/>
+                  </w:rPr>
+                  <w:t>1.</w:t>
+                </w:r>
+                <w:r>
+                  <w:rPr>
+                    <w:rFonts w:asciiTheme="minorHAnsi" w:eastAsiaTheme="minorEastAsia" w:hAnsiTheme="minorHAnsi"/>
+                    <w:noProof/>
+                    <w:lang w:val="en-GB" w:eastAsia="en-GB"/>
+                  </w:rPr>
+                  <w:tab/>
+                </w:r>
+                <w:r>
+                  <w:rPr>
+                    <w:rStyle w:val="Hyperlink"/>
+                    <w:noProof/>
+                  </w:rPr>
+                  <w:t>Účel aplikace</w:t>
+                </w:r>
+                <w:r>
+                  <w:rPr>
+                    <w:noProof/>
+                    <w:webHidden/>
+                  </w:rPr>
+                  <w:tab/>
+                </w:r>
+                <w:r>
+                  <w:rPr>
+                    <w:noProof/>
+                    <w:webHidden/>
+                  </w:rPr>
+                  <w:fldChar w:fldCharType="begin"/>
+                </w:r>
+                <w:r>
+                  <w:rPr>
+                    <w:noProof/>
+                    <w:webHidden/>
+                  </w:rPr>
+                  <w:instrText xml:space="preserve"> PAGEREF _Toc229437719 \h </w:instrText>
+                </w:r>
+                <w:r>
+                  <w:rPr>
+                    <w:noProof/>
+                    <w:webHidden/>
+                  </w:rPr>
+                </w:r>
+                <w:r>
+                  <w:rPr>
+                    <w:noProof/>
+                    <w:webHidden/>
+                  </w:rPr>
+                  <w:fldChar w:fldCharType="separate"/>
+                </w:r>
+                <w:r>
+                  <w:rPr>
+                    <w:noProof/>
+                    <w:webHidden/>
+                  </w:rPr>
+                  <w:t>2</w:t>
+                </w:r>
+                <w:r>
+                  <w:rPr>
+                    <w:noProof/>
+                    <w:webHidden/>
+                  </w:rPr>
+                  <w:fldChar w:fldCharType="end"/>
+                </w:r>
+              </w:hyperlink>
+            </w:p>
+            <w:p>
+              <w:pPr>
+                <w:pStyle w:val="TOC1"/>
+                <w:tabs>
+                  <w:tab w:val="left" w:pos="1200"/>
+                  <w:tab w:val="right" w:leader="dot" w:pos="9016"/>
+                </w:tabs>
+                <w:rPr>
+                  <w:rFonts w:asciiTheme="minorHAnsi" w:eastAsiaTheme="minorEastAsia" w:hAnsiTheme="minorHAnsi"/>
+                  <w:noProof/>
+                  <w:lang w:val="en-GB" w:eastAsia="en-GB"/>
+                </w:rPr>
+              </w:pPr>
+              <w:hyperlink w:anchor="_Toc229437720" w:history="1">
+                <w:r>
+                  <w:rPr>
+                    <w:rStyle w:val="Hyperlink"/>
+                    <w:noProof/>
+                  </w:rPr>
+                  <w:t>2.</w:t>
+                </w:r>
+                <w:r>
+                  <w:rPr>
+                    <w:rFonts w:asciiTheme="minorHAnsi" w:eastAsiaTheme="minorEastAsia" w:hAnsiTheme="minorHAnsi"/>
+                    <w:noProof/>
+                    <w:lang w:val="en-GB" w:eastAsia="en-GB"/>
+                  </w:rPr>
+                  <w:tab/>
+                </w:r>
+                <w:r>
+                  <w:rPr>
+                    <w:rStyle w:val="Hyperlink"/>
+                    <w:noProof/>
+                  </w:rPr>
+                  <w:t>Implementované případy užití</w:t>
+                </w:r>
+                <w:r>
+                  <w:rPr>
+                    <w:noProof/>
+                    <w:webHidden/>
+                  </w:rPr>
+                  <w:tab/>
+                </w:r>
+                <w:r>
+                  <w:rPr>
+                    <w:noProof/>
+                    <w:webHidden/>
+                  </w:rPr>
+                  <w:fldChar w:fldCharType="begin"/>
+                </w:r>
+                <w:r>
+                  <w:rPr>
+                    <w:noProof/>
+                    <w:webHidden/>
+                  </w:rPr>
+                  <w:instrText xml:space="preserve"> PAGEREF _Toc229437720 \h </w:instrText>
+                </w:r>
+                <w:r>
+                  <w:rPr>
+                    <w:noProof/>
+                    <w:webHidden/>
+                  </w:rPr>
+                </w:r>
+                <w:r>
+                  <w:rPr>
+                    <w:noProof/>
+                    <w:webHidden/>
+                  </w:rPr>
+                  <w:fldChar w:fldCharType="separate"/>
+                </w:r>
+                <w:r>
+                  <w:rPr>
+                    <w:noProof/>
+                    <w:webHidden/>
+                  </w:rPr>
+                  <w:t>3</w:t>
+                </w:r>
+                <w:r>
+                  <w:rPr>
+                    <w:noProof/>
+                    <w:webHidden/>
+                  </w:rPr>
+                  <w:fldChar w:fldCharType="end"/>
+                </w:r>
+              </w:hyperlink>
+            </w:p>
+            <w:p>
+              <w:pPr>
+                <w:pStyle w:val="TOC1"/>
+                <w:tabs>
+                  <w:tab w:val="left" w:pos="1200"/>
+                  <w:tab w:val="right" w:leader="dot" w:pos="9016"/>
+                </w:tabs>
+                <w:rPr>
+                  <w:rFonts w:asciiTheme="minorHAnsi" w:eastAsiaTheme="minorEastAsia" w:hAnsiTheme="minorHAnsi"/>
+                  <w:noProof/>
+                  <w:lang w:val="en-GB" w:eastAsia="en-GB"/>
+                </w:rPr>
+              </w:pPr>
+              <w:hyperlink w:anchor="_Toc229437721" w:history="1">
+                <w:r>
+                  <w:rPr>
+                    <w:rStyle w:val="Hyperlink"/>
+                    <w:noProof/>
+                  </w:rPr>
+                  <w:t>3.</w:t>
+                </w:r>
+                <w:r>
+                  <w:rPr>
+                    <w:rFonts w:asciiTheme="minorHAnsi" w:eastAsiaTheme="minorEastAsia" w:hAnsiTheme="minorHAnsi"/>
+                    <w:noProof/>
+                    <w:lang w:val="en-GB" w:eastAsia="en-GB"/>
+                  </w:rPr>
+                  <w:tab/>
+                </w:r>
+                <w:r>
+                  <w:rPr>
+                    <w:rStyle w:val="Hyperlink"/>
+                    <w:noProof/>
+                  </w:rPr>
+                  <w:t>Architektura a návrh</w:t>
+                </w:r>
+                <w:r>
+                  <w:rPr>
+                    <w:noProof/>
+                    <w:webHidden/>
+                  </w:rPr>
+                  <w:tab/>
+                </w:r>
+                <w:r>
+                  <w:rPr>
+                    <w:noProof/>
+                    <w:webHidden/>
+                  </w:rPr>
+                  <w:fldChar w:fldCharType="begin"/>
+                </w:r>
+                <w:r>
+                  <w:rPr>
+                    <w:noProof/>
+                    <w:webHidden/>
+                  </w:rPr>
+                  <w:instrText xml:space="preserve"> PAGEREF _Toc229437721 \h </w:instrText>
+                </w:r>
+                <w:r>
+                  <w:rPr>
+                    <w:noProof/>
+                    <w:webHidden/>
+                  </w:rPr>
+                </w:r>
+                <w:r>
+                  <w:rPr>
+                    <w:noProof/>
+                    <w:webHidden/>
+                  </w:rPr>
+                  <w:fldChar w:fldCharType="separate"/>
+                </w:r>
+                <w:r>
+                  <w:rPr>
+                    <w:noProof/>
+                    <w:webHidden/>
+                  </w:rPr>
+                  <w:t>4</w:t>
+                </w:r>
+                <w:r>
+                  <w:rPr>
+                    <w:noProof/>
+                    <w:webHidden/>
+                  </w:rPr>
+                  <w:fldChar w:fldCharType="end"/>
+                </w:r>
+              </w:hyperlink>
+            </w:p>
+            <w:p>
+              <w:pPr>
+                <w:pStyle w:val="TOC2"/>
+                <w:tabs>
+                  <w:tab w:val="left" w:pos="1680"/>
+                  <w:tab w:val="right" w:leader="dot" w:pos="9016"/>
+                </w:tabs>
+                <w:rPr>
+                  <w:rFonts w:asciiTheme="minorHAnsi" w:eastAsiaTheme="minorEastAsia" w:hAnsiTheme="minorHAnsi"/>
+                  <w:noProof/>
+                  <w:lang w:val="en-GB" w:eastAsia="en-GB"/>
+                </w:rPr>
+              </w:pPr>
+              <w:hyperlink w:anchor="_Toc229437722" w:history="1">
+                <w:r>
+                  <w:rPr>
+                    <w:rStyle w:val="Hyperlink"/>
+                    <w:noProof/>
+                  </w:rPr>
+                  <w:t>3.1.</w:t>
+                </w:r>
+                <w:r>
+                  <w:rPr>
+                    <w:rFonts w:asciiTheme="minorHAnsi" w:eastAsiaTheme="minorEastAsia" w:hAnsiTheme="minorHAnsi"/>
+                    <w:noProof/>
+                    <w:lang w:val="en-GB" w:eastAsia="en-GB"/>
+                  </w:rPr>
+                  <w:tab/>
+                </w:r>
+                <w:r>
+                  <w:rPr>
+                    <w:rStyle w:val="Hyperlink"/>
+                    <w:noProof/>
+                  </w:rPr>
+                  <w:t>Datový model</w:t>
+                </w:r>
+                <w:r>
+                  <w:rPr>
+                    <w:noProof/>
+                    <w:webHidden/>
+                  </w:rPr>
+                  <w:tab/>
+                </w:r>
+                <w:r>
+                  <w:rPr>
+                    <w:noProof/>
+                    <w:webHidden/>
+                  </w:rPr>
+                  <w:fldChar w:fldCharType="begin"/>
+                </w:r>
+                <w:r>
+                  <w:rPr>
+                    <w:noProof/>
+                    <w:webHidden/>
+                  </w:rPr>
+                  <w:instrText xml:space="preserve"> PAGEREF _Toc229437722 \h </w:instrText>
+                </w:r>
+                <w:r>
+                  <w:rPr>
+                    <w:noProof/>
+                    <w:webHidden/>
+                  </w:rPr>
+                </w:r>
+                <w:r>
+                  <w:rPr>
+                    <w:noProof/>
+                    <w:webHidden/>
+                  </w:rPr>
+                  <w:fldChar w:fldCharType="separate"/>
+                </w:r>
+                <w:r>
+                  <w:rPr>
+                    <w:noProof/>
+                    <w:webHidden/>
+                  </w:rPr>
+                  <w:t>4</w:t>
+                </w:r>
+                <w:r>
+                  <w:rPr>
+                    <w:noProof/>
+                    <w:webHidden/>
+                  </w:rPr>
+                  <w:fldChar w:fldCharType="end"/>
+                </w:r>
+              </w:hyperlink>
+            </w:p>
+            <w:p>
+              <w:pPr>
+                <w:pStyle w:val="TOC2"/>
+                <w:tabs>
+                  <w:tab w:val="left" w:pos="1680"/>
+                  <w:tab w:val="right" w:leader="dot" w:pos="9016"/>
+                </w:tabs>
+                <w:rPr>
+                  <w:rFonts w:asciiTheme="minorHAnsi" w:eastAsiaTheme="minorEastAsia" w:hAnsiTheme="minorHAnsi"/>
+                  <w:noProof/>
+                  <w:lang w:val="en-GB" w:eastAsia="en-GB"/>
+                </w:rPr>
+              </w:pPr>
+              <w:hyperlink w:anchor="_Toc229437723" w:history="1">
+                <w:r>
+                  <w:rPr>
+                    <w:rStyle w:val="Hyperlink"/>
+                    <w:noProof/>
+                  </w:rPr>
+                  <w:t>3.2.</w:t>
+                </w:r>
+                <w:r>
+                  <w:rPr>
+                    <w:rFonts w:asciiTheme="minorHAnsi" w:eastAsiaTheme="minorEastAsia" w:hAnsiTheme="minorHAnsi"/>
+                    <w:noProof/>
+                    <w:lang w:val="en-GB" w:eastAsia="en-GB"/>
+                  </w:rPr>
+                  <w:tab/>
+                </w:r>
+                <w:r>
+                  <w:rPr>
+                    <w:rStyle w:val="Hyperlink"/>
+                    <w:noProof/>
+                  </w:rPr>
+                  <w:t>Softwarová architektura</w:t>
+                </w:r>
+                <w:r>
+                  <w:rPr>
+                    <w:noProof/>
+                    <w:webHidden/>
+                  </w:rPr>
+                  <w:tab/>
+                </w:r>
+                <w:r>
+                  <w:rPr>
+                    <w:noProof/>
+                    <w:webHidden/>
+                  </w:rPr>
+                  <w:fldChar w:fldCharType="begin"/>
+                </w:r>
+                <w:r>
+                  <w:rPr>
+                    <w:noProof/>
+                    <w:webHidden/>
+                  </w:rPr>
+                  <w:instrText xml:space="preserve"> PAGEREF _Toc229437723 \h </w:instrText>
+                </w:r>
+                <w:r>
+                  <w:rPr>
+                    <w:noProof/>
+                    <w:webHidden/>
+                  </w:rPr>
+                </w:r>
+                <w:r>
+                  <w:rPr>
+                    <w:noProof/>
+                    <w:webHidden/>
+                  </w:rPr>
+                  <w:fldChar w:fldCharType="separate"/>
+                </w:r>
+                <w:r>
+                  <w:rPr>
+                    <w:noProof/>
+                    <w:webHidden/>
+                  </w:rPr>
+                  <w:t>5</w:t>
+                </w:r>
+                <w:r>
+                  <w:rPr>
+                    <w:noProof/>
+                    <w:webHidden/>
+                  </w:rPr>
+                  <w:fldChar w:fldCharType="end"/>
+                </w:r>
+              </w:hyperlink>
+            </w:p>
+            <w:p>
+              <w:pPr>
+                <w:pStyle w:val="TOC3"/>
+                <w:tabs>
+                  <w:tab w:val="right" w:leader="dot" w:pos="9016"/>
+                </w:tabs>
+                <w:rPr>
+                  <w:rFonts w:asciiTheme="minorHAnsi" w:eastAsiaTheme="minorEastAsia" w:hAnsiTheme="minorHAnsi"/>
+                  <w:noProof/>
+                  <w:lang w:val="en-GB" w:eastAsia="en-GB"/>
+                </w:rPr>
+              </w:pPr>
+              <w:hyperlink w:anchor="_Toc229437724" w:history="1">
+                <w:r>
+                  <w:rPr>
+                    <w:rStyle w:val="Hyperlink"/>
+                    <w:noProof/>
+                  </w:rPr>
+                  <w:t>3.2.1 Kontrolery</w:t>
+                </w:r>
+                <w:r>
+                  <w:rPr>
+                    <w:noProof/>
+                    <w:webHidden/>
+                  </w:rPr>
+                  <w:tab/>
+                </w:r>
+                <w:r>
+                  <w:rPr>
+                    <w:noProof/>
+                    <w:webHidden/>
+                  </w:rPr>
+                  <w:fldChar w:fldCharType="begin"/>
+                </w:r>
+                <w:r>
+                  <w:rPr>
+                    <w:noProof/>
+                    <w:webHidden/>
+                  </w:rPr>
+                  <w:instrText xml:space="preserve"> PAGEREF _Toc229437724 \h </w:instrText>
+                </w:r>
+                <w:r>
+                  <w:rPr>
+                    <w:noProof/>
+                    <w:webHidden/>
+                  </w:rPr>
+                </w:r>
+                <w:r>
+                  <w:rPr>
+                    <w:noProof/>
+                    <w:webHidden/>
+                  </w:rPr>
+                  <w:fldChar w:fldCharType="separate"/>
+                </w:r>
+                <w:r>
+                  <w:rPr>
+                    <w:noProof/>
+                    <w:webHidden/>
+                  </w:rPr>
+                  <w:t>5</w:t>
+                </w:r>
+                <w:r>
+                  <w:rPr>
+                    <w:noProof/>
+                    <w:webHidden/>
+                  </w:rPr>
+                  <w:fldChar w:fldCharType="end"/>
+                </w:r>
+              </w:hyperlink>
+            </w:p>
+            <w:p>
+              <w:pPr>
+                <w:pStyle w:val="TOC3"/>
+                <w:tabs>
+                  <w:tab w:val="right" w:leader="dot" w:pos="9016"/>
+                </w:tabs>
+                <w:rPr>
+                  <w:rFonts w:asciiTheme="minorHAnsi" w:eastAsiaTheme="minorEastAsia" w:hAnsiTheme="minorHAnsi"/>
+                  <w:noProof/>
+                  <w:lang w:val="en-GB" w:eastAsia="en-GB"/>
+                </w:rPr>
+              </w:pPr>
+              <w:hyperlink w:anchor="_Toc229437725" w:history="1">
+                <w:r>
+                  <w:rPr>
+                    <w:rStyle w:val="Hyperlink"/>
+                    <w:noProof/>
+                  </w:rPr>
+                  <w:t>3.2.2. Datová vrstva</w:t>
+                </w:r>
+                <w:r>
+                  <w:rPr>
+                    <w:noProof/>
+                    <w:webHidden/>
+                  </w:rPr>
+                  <w:tab/>
+                </w:r>
+                <w:r>
+                  <w:rPr>
+                    <w:noProof/>
+                    <w:webHidden/>
+                  </w:rPr>
+                  <w:fldChar w:fldCharType="begin"/>
+                </w:r>
+                <w:r>
+                  <w:rPr>
+                    <w:noProof/>
+                    <w:webHidden/>
+                  </w:rPr>
+                  <w:instrText xml:space="preserve"> PAGEREF _Toc229437725 \h </w:instrText>
+                </w:r>
+                <w:r>
+                  <w:rPr>
+                    <w:noProof/>
+                    <w:webHidden/>
+                  </w:rPr>
+                </w:r>
+                <w:r>
+                  <w:rPr>
+                    <w:noProof/>
+                    <w:webHidden/>
+                  </w:rPr>
+                  <w:fldChar w:fldCharType="separate"/>
+                </w:r>
+                <w:r>
+                  <w:rPr>
+                    <w:noProof/>
+                    <w:webHidden/>
+                  </w:rPr>
+                  <w:t>6</w:t>
+                </w:r>
+                <w:r>
+                  <w:rPr>
+                    <w:noProof/>
+                    <w:webHidden/>
+                  </w:rPr>
+                  <w:fldChar w:fldCharType="end"/>
+                </w:r>
+              </w:hyperlink>
+            </w:p>
+            <w:p>
+              <w:pPr>
+                <w:pStyle w:val="TOC3"/>
+                <w:tabs>
+                  <w:tab w:val="right" w:leader="dot" w:pos="9016"/>
+                </w:tabs>
+                <w:rPr>
+                  <w:rFonts w:asciiTheme="minorHAnsi" w:eastAsiaTheme="minorEastAsia" w:hAnsiTheme="minorHAnsi"/>
+                  <w:noProof/>
+                  <w:lang w:val="en-GB" w:eastAsia="en-GB"/>
+                </w:rPr>
+              </w:pPr>
+              <w:hyperlink w:anchor="_Toc229437726" w:history="1">
+                <w:r>
+                  <w:rPr>
+                    <w:rStyle w:val="Hyperlink"/>
+                    <w:noProof/>
+                  </w:rPr>
+                  <w:t>3.2.3 Pohledy</w:t>
+                </w:r>
+                <w:r>
+                  <w:rPr>
+                    <w:noProof/>
+                    <w:webHidden/>
+                  </w:rPr>
+                  <w:tab/>
+                </w:r>
+                <w:r>
+                  <w:rPr>
+                    <w:noProof/>
+                    <w:webHidden/>
+                  </w:rPr>
+                  <w:fldChar w:fldCharType="begin"/>
+                </w:r>
+                <w:r>
+                  <w:rPr>
+                    <w:noProof/>
+                    <w:webHidden/>
+                  </w:rPr>
+                  <w:instrText xml:space="preserve"> PAGEREF _Toc229437726 \h </w:instrText>
+                </w:r>
+                <w:r>
+                  <w:rPr>
+                    <w:noProof/>
+                    <w:webHidden/>
+                  </w:rPr>
+                </w:r>
+                <w:r>
+                  <w:rPr>
+                    <w:noProof/>
+                    <w:webHidden/>
+                  </w:rPr>
+                  <w:fldChar w:fldCharType="separate"/>
+                </w:r>
+                <w:r>
+                  <w:rPr>
+                    <w:noProof/>
+                    <w:webHidden/>
+                  </w:rPr>
+                  <w:t>6</w:t>
+                </w:r>
+                <w:r>
+                  <w:rPr>
+                    <w:noProof/>
+                    <w:webHidden/>
+                  </w:rPr>
+                  <w:fldChar w:fldCharType="end"/>
+                </w:r>
+              </w:hyperlink>
+            </w:p>
+            <w:p>
+              <w:pPr>
+                <w:pStyle w:val="TOC2"/>
+                <w:tabs>
+                  <w:tab w:val="left" w:pos="1680"/>
+                  <w:tab w:val="right" w:leader="dot" w:pos="9016"/>
+                </w:tabs>
+                <w:rPr>
+                  <w:rFonts w:asciiTheme="minorHAnsi" w:eastAsiaTheme="minorEastAsia" w:hAnsiTheme="minorHAnsi"/>
+                  <w:noProof/>
+                  <w:lang w:val="en-GB" w:eastAsia="en-GB"/>
+                </w:rPr>
+              </w:pPr>
+              <w:hyperlink w:anchor="_Toc229437727" w:history="1">
+                <w:r>
+                  <w:rPr>
+                    <w:rStyle w:val="Hyperlink"/>
+                    <w:noProof/>
+                  </w:rPr>
+                  <w:t>3.3.</w:t>
+                </w:r>
+                <w:r>
+                  <w:rPr>
+                    <w:rFonts w:asciiTheme="minorHAnsi" w:eastAsiaTheme="minorEastAsia" w:hAnsiTheme="minorHAnsi"/>
+                    <w:noProof/>
+                    <w:lang w:val="en-GB" w:eastAsia="en-GB"/>
+                  </w:rPr>
+                  <w:tab/>
+                </w:r>
+                <w:r>
+                  <w:rPr>
+                    <w:rStyle w:val="Hyperlink"/>
+                    <w:noProof/>
+                  </w:rPr>
+                  <w:t>Struktura implementace</w:t>
+                </w:r>
+                <w:r>
+                  <w:rPr>
+                    <w:noProof/>
+                    <w:webHidden/>
+                  </w:rPr>
+                  <w:tab/>
+                </w:r>
+                <w:r>
+                  <w:rPr>
+                    <w:noProof/>
+                    <w:webHidden/>
+                  </w:rPr>
+                  <w:fldChar w:fldCharType="begin"/>
+                </w:r>
+                <w:r>
+                  <w:rPr>
+                    <w:noProof/>
+                    <w:webHidden/>
+                  </w:rPr>
+                  <w:instrText xml:space="preserve"> PAGEREF _Toc229437727 \h </w:instrText>
+                </w:r>
+                <w:r>
+                  <w:rPr>
+                    <w:noProof/>
+                    <w:webHidden/>
+                  </w:rPr>
+                </w:r>
+                <w:r>
+                  <w:rPr>
+                    <w:noProof/>
+                    <w:webHidden/>
+                  </w:rPr>
+                  <w:fldChar w:fldCharType="separate"/>
+                </w:r>
+                <w:r>
+                  <w:rPr>
+                    <w:noProof/>
+                    <w:webHidden/>
+                  </w:rPr>
+                  <w:t>6</w:t>
+                </w:r>
+                <w:r>
+                  <w:rPr>
+                    <w:noProof/>
+                    <w:webHidden/>
+                  </w:rPr>
+                  <w:fldChar w:fldCharType="end"/>
+                </w:r>
+              </w:hyperlink>
+            </w:p>
+            <w:p>
+              <w:pPr>
+                <w:pStyle w:val="TOC2"/>
+                <w:tabs>
+                  <w:tab w:val="left" w:pos="1680"/>
+                  <w:tab w:val="right" w:leader="dot" w:pos="9016"/>
+                </w:tabs>
+                <w:rPr>
+                  <w:rFonts w:asciiTheme="minorHAnsi" w:eastAsiaTheme="minorEastAsia" w:hAnsiTheme="minorHAnsi"/>
+                  <w:noProof/>
+                  <w:lang w:val="en-GB" w:eastAsia="en-GB"/>
+                </w:rPr>
+              </w:pPr>
+              <w:hyperlink w:anchor="_Toc229437728" w:history="1">
+                <w:r>
+                  <w:rPr>
+                    <w:rStyle w:val="Hyperlink"/>
+                    <w:noProof/>
+                  </w:rPr>
+                  <w:t>3.4.</w:t>
+                </w:r>
+                <w:r>
+                  <w:rPr>
+                    <w:rFonts w:asciiTheme="minorHAnsi" w:eastAsiaTheme="minorEastAsia" w:hAnsiTheme="minorHAnsi"/>
+                    <w:noProof/>
+                    <w:lang w:val="en-GB" w:eastAsia="en-GB"/>
+                  </w:rPr>
+                  <w:tab/>
+                </w:r>
+                <w:r>
+                  <w:rPr>
+                    <w:rStyle w:val="Hyperlink"/>
+                    <w:noProof/>
+                  </w:rPr>
+                  <w:t>Nasazení</w:t>
+                </w:r>
+                <w:r>
+                  <w:rPr>
+                    <w:noProof/>
+                    <w:webHidden/>
+                  </w:rPr>
+                  <w:tab/>
+                </w:r>
+                <w:r>
+                  <w:rPr>
+                    <w:noProof/>
+                    <w:webHidden/>
+                  </w:rPr>
+                  <w:fldChar w:fldCharType="begin"/>
+                </w:r>
+                <w:r>
+                  <w:rPr>
+                    <w:noProof/>
+                    <w:webHidden/>
+                  </w:rPr>
+                  <w:instrText xml:space="preserve"> PAGEREF _Toc229437728 \h </w:instrText>
+                </w:r>
+                <w:r>
+                  <w:rPr>
+                    <w:noProof/>
+                    <w:webHidden/>
+                  </w:rPr>
+                </w:r>
+                <w:r>
+                  <w:rPr>
+                    <w:noProof/>
+                    <w:webHidden/>
+                  </w:rPr>
+                  <w:fldChar w:fldCharType="separate"/>
+                </w:r>
+                <w:r>
+                  <w:rPr>
+                    <w:noProof/>
+                    <w:webHidden/>
+                  </w:rPr>
+                  <w:t>6</w:t>
+                </w:r>
+                <w:r>
+                  <w:rPr>
+                    <w:noProof/>
+                    <w:webHidden/>
+                  </w:rPr>
+                  <w:fldChar w:fldCharType="end"/>
+                </w:r>
+              </w:hyperlink>
+            </w:p>
+            <w:p>
+              <w:pPr>
+                <w:pStyle w:val="TOC1"/>
+                <w:tabs>
+                  <w:tab w:val="left" w:pos="1200"/>
+                  <w:tab w:val="right" w:leader="dot" w:pos="9016"/>
+                </w:tabs>
+                <w:rPr>
+                  <w:rFonts w:asciiTheme="minorHAnsi" w:eastAsiaTheme="minorEastAsia" w:hAnsiTheme="minorHAnsi"/>
+                  <w:noProof/>
+                  <w:lang w:val="en-GB" w:eastAsia="en-GB"/>
+                </w:rPr>
+              </w:pPr>
+              <w:hyperlink w:anchor="_Toc229437729" w:history="1">
+                <w:r>
+                  <w:rPr>
+                    <w:rStyle w:val="Hyperlink"/>
+                    <w:noProof/>
+                  </w:rPr>
+                  <w:t>4.</w:t>
+                </w:r>
+                <w:r>
+                  <w:rPr>
+                    <w:rFonts w:asciiTheme="minorHAnsi" w:eastAsiaTheme="minorEastAsia" w:hAnsiTheme="minorHAnsi"/>
+                    <w:noProof/>
+                    <w:lang w:val="en-GB" w:eastAsia="en-GB"/>
+                  </w:rPr>
+                  <w:tab/>
+                </w:r>
+                <w:r>
+                  <w:rPr>
+                    <w:rStyle w:val="Hyperlink"/>
+                    <w:noProof/>
+                  </w:rPr>
+                  <w:t>Finální podoba aplikace</w:t>
+                </w:r>
+                <w:r>
+                  <w:rPr>
+                    <w:noProof/>
+                    <w:webHidden/>
+                  </w:rPr>
+                  <w:tab/>
+                </w:r>
+                <w:r>
+                  <w:rPr>
+                    <w:noProof/>
+                    <w:webHidden/>
+                  </w:rPr>
+                  <w:fldChar w:fldCharType="begin"/>
+                </w:r>
+                <w:r>
+                  <w:rPr>
+                    <w:noProof/>
+                    <w:webHidden/>
+                  </w:rPr>
+                  <w:instrText xml:space="preserve"> PAGEREF _Toc229437729 \h </w:instrText>
+                </w:r>
+                <w:r>
+                  <w:rPr>
+                    <w:noProof/>
+                    <w:webHidden/>
+                  </w:rPr>
+                </w:r>
+                <w:r>
+                  <w:rPr>
+                    <w:noProof/>
+                    <w:webHidden/>
+                  </w:rPr>
+                  <w:fldChar w:fldCharType="separate"/>
+                </w:r>
+                <w:r>
+                  <w:rPr>
+                    <w:noProof/>
+                    <w:webHidden/>
+                  </w:rPr>
+                  <w:t>8</w:t>
+                </w:r>
+                <w:r>
+                  <w:rPr>
+                    <w:noProof/>
+                    <w:webHidden/>
+                  </w:rPr>
+                  <w:fldChar w:fldCharType="end"/>
+                </w:r>
+              </w:hyperlink>
+            </w:p>
+            <w:p>
+              <w:pPr>
+                <w:pStyle w:val="TOC2"/>
+                <w:tabs>
+                  <w:tab w:val="right" w:leader="dot" w:pos="9016"/>
+                </w:tabs>
+                <w:rPr>
+                  <w:rFonts w:asciiTheme="minorHAnsi" w:eastAsiaTheme="minorEastAsia" w:hAnsiTheme="minorHAnsi"/>
+                  <w:noProof/>
+                  <w:lang w:val="en-GB" w:eastAsia="en-GB"/>
+                </w:rPr>
+              </w:pPr>
+              <w:hyperlink w:anchor="_Toc229437730" w:history="1">
+                <w:r>
+                  <w:rPr>
+                    <w:rStyle w:val="Hyperlink"/>
+                    <w:noProof/>
+                  </w:rPr>
+                  <w:t>4.1. Uživatelské rozhraní</w:t>
+                </w:r>
+                <w:r>
+                  <w:rPr>
+                    <w:noProof/>
+                    <w:webHidden/>
+                  </w:rPr>
+                  <w:tab/>
+                </w:r>
+                <w:r>
+                  <w:rPr>
+                    <w:noProof/>
+                    <w:webHidden/>
+                  </w:rPr>
+                  <w:fldChar w:fldCharType="begin"/>
+                </w:r>
+                <w:r>
+                  <w:rPr>
+                    <w:noProof/>
+                    <w:webHidden/>
+                  </w:rPr>
+                  <w:instrText xml:space="preserve"> PAGEREF _Toc229437730 \h </w:instrText>
+                </w:r>
+                <w:r>
+                  <w:rPr>
+                    <w:noProof/>
+                    <w:webHidden/>
+                  </w:rPr>
+                </w:r>
+                <w:r>
+                  <w:rPr>
+                    <w:noProof/>
+                    <w:webHidden/>
+                  </w:rPr>
+                  <w:fldChar w:fldCharType="separate"/>
+                </w:r>
+                <w:r>
+                  <w:rPr>
+                    <w:noProof/>
+                    <w:webHidden/>
+                  </w:rPr>
+                  <w:t>8</w:t>
+                </w:r>
+                <w:r>
+                  <w:rPr>
+                    <w:noProof/>
+                    <w:webHidden/>
+                  </w:rPr>
+                  <w:fldChar w:fldCharType="end"/>
+                </w:r>
+              </w:hyperlink>
+            </w:p>
+            <w:p>
+              <w:pPr>
+                <w:pStyle w:val="TOC2"/>
+                <w:tabs>
+                  <w:tab w:val="right" w:leader="dot" w:pos="9016"/>
+                </w:tabs>
+                <w:rPr>
+                  <w:rFonts w:asciiTheme="minorHAnsi" w:eastAsiaTheme="minorEastAsia" w:hAnsiTheme="minorHAnsi"/>
+                  <w:noProof/>
+                  <w:lang w:val="en-GB" w:eastAsia="en-GB"/>
+                </w:rPr>
+              </w:pPr>
+              <w:hyperlink w:anchor="_Toc229437731" w:history="1">
+                <w:r>
+                  <w:rPr>
+                    <w:rStyle w:val="Hyperlink"/>
+                    <w:noProof/>
+                  </w:rPr>
+                  <w:t>4.2. REST API a klient pro ČSSZ</w:t>
+                </w:r>
+                <w:r>
+                  <w:rPr>
+                    <w:noProof/>
+                    <w:webHidden/>
+                  </w:rPr>
+                  <w:tab/>
+                </w:r>
+                <w:r>
+                  <w:rPr>
+                    <w:noProof/>
+                    <w:webHidden/>
+                  </w:rPr>
+                  <w:fldChar w:fldCharType="begin"/>
+                </w:r>
+                <w:r>
+                  <w:rPr>
+                    <w:noProof/>
+                    <w:webHidden/>
+                  </w:rPr>
+                  <w:instrText xml:space="preserve"> PAGEREF _Toc229437731 \h </w:instrText>
+                </w:r>
+                <w:r>
+                  <w:rPr>
+                    <w:noProof/>
+                    <w:webHidden/>
+                  </w:rPr>
+                </w:r>
+                <w:r>
+                  <w:rPr>
+                    <w:noProof/>
+                    <w:webHidden/>
+                  </w:rPr>
+                  <w:fldChar w:fldCharType="separate"/>
+                </w:r>
+                <w:r>
+                  <w:rPr>
+                    <w:noProof/>
+                    <w:webHidden/>
+                  </w:rPr>
+                  <w:t>9</w:t>
+                </w:r>
+                <w:r>
+                  <w:rPr>
+                    <w:noProof/>
+                    <w:webHidden/>
+                  </w:rPr>
+                  <w:fldChar w:fldCharType="end"/>
+                </w:r>
+              </w:hyperlink>
+            </w:p>
+            <w:p>
+              <w:pPr>
+                <w:pStyle w:val="TOC2"/>
+                <w:tabs>
+                  <w:tab w:val="right" w:leader="dot" w:pos="9016"/>
+                </w:tabs>
+                <w:rPr>
+                  <w:rFonts w:asciiTheme="minorHAnsi" w:eastAsiaTheme="minorEastAsia" w:hAnsiTheme="minorHAnsi"/>
+                  <w:noProof/>
+                  <w:lang w:val="en-GB" w:eastAsia="en-GB"/>
+                </w:rPr>
+              </w:pPr>
+              <w:hyperlink w:anchor="_Toc229437732" w:history="1">
+                <w:r>
+                  <w:rPr>
+                    <w:rStyle w:val="Hyperlink"/>
+                    <w:noProof/>
+                  </w:rPr>
+                  <w:t>4.3. Prostor pro rozšíření</w:t>
+                </w:r>
+                <w:r>
+                  <w:rPr>
+                    <w:noProof/>
+                    <w:webHidden/>
+                  </w:rPr>
+                  <w:tab/>
+                </w:r>
+                <w:r>
+                  <w:rPr>
+                    <w:noProof/>
+                    <w:webHidden/>
+                  </w:rPr>
+                  <w:fldChar w:fldCharType="begin"/>
+                </w:r>
+                <w:r>
+                  <w:rPr>
+                    <w:noProof/>
+                    <w:webHidden/>
+                  </w:rPr>
+                  <w:instrText xml:space="preserve"> PAGEREF _Toc229437732 \h </w:instrText>
+                </w:r>
+                <w:r>
+                  <w:rPr>
+                    <w:noProof/>
+                    <w:webHidden/>
+                  </w:rPr>
+                </w:r>
+                <w:r>
+                  <w:rPr>
+                    <w:noProof/>
+                    <w:webHidden/>
+                  </w:rPr>
+                  <w:fldChar w:fldCharType="separate"/>
+                </w:r>
+                <w:r>
+                  <w:rPr>
+                    <w:noProof/>
+                    <w:webHidden/>
+                  </w:rPr>
+                  <w:t>10</w:t>
+                </w:r>
+                <w:r>
+                  <w:rPr>
+                    <w:noProof/>
+                    <w:webHidden/>
+                  </w:rPr>
+                  <w:fldChar w:fldCharType="end"/>
+                </w:r>
+              </w:hyperlink>
+            </w:p>
+            <w:p>
+              <w:pPr>
+                <w:pStyle w:val="TOC1"/>
+                <w:tabs>
+                  <w:tab w:val="left" w:pos="1200"/>
+                  <w:tab w:val="right" w:leader="dot" w:pos="9016"/>
+                </w:tabs>
+                <w:rPr>
+                  <w:rFonts w:asciiTheme="minorHAnsi" w:eastAsiaTheme="minorEastAsia" w:hAnsiTheme="minorHAnsi"/>
+                  <w:noProof/>
+                  <w:lang w:val="en-GB" w:eastAsia="en-GB"/>
+                </w:rPr>
+              </w:pPr>
+              <w:hyperlink w:anchor="_Toc229437733" w:history="1">
+                <w:r>
+                  <w:rPr>
+                    <w:rStyle w:val="Hyperlink"/>
+                    <w:noProof/>
+                  </w:rPr>
+                  <w:t>5.</w:t>
+                </w:r>
+                <w:r>
+                  <w:rPr>
+                    <w:rFonts w:asciiTheme="minorHAnsi" w:eastAsiaTheme="minorEastAsia" w:hAnsiTheme="minorHAnsi"/>
+                    <w:noProof/>
+                    <w:lang w:val="en-GB" w:eastAsia="en-GB"/>
+                  </w:rPr>
+                  <w:tab/>
+                </w:r>
+                <w:r>
+                  <w:rPr>
+                    <w:rStyle w:val="Hyperlink"/>
+                    <w:noProof/>
+                  </w:rPr>
+                  <w:t>Upozornění</w:t>
+                </w:r>
+                <w:r>
+                  <w:rPr>
+                    <w:noProof/>
+                    <w:webHidden/>
+                  </w:rPr>
+                  <w:tab/>
+                </w:r>
+                <w:r>
+                  <w:rPr>
+                    <w:noProof/>
+                    <w:webHidden/>
+                  </w:rPr>
+                  <w:fldChar w:fldCharType="begin"/>
+                </w:r>
+                <w:r>
+                  <w:rPr>
+                    <w:noProof/>
+                    <w:webHidden/>
+                  </w:rPr>
+                  <w:instrText xml:space="preserve"> PAGEREF _Toc229437733 \h </w:instrText>
+                </w:r>
+                <w:r>
+                  <w:rPr>
+                    <w:noProof/>
+                    <w:webHidden/>
+                  </w:rPr>
+                </w:r>
+                <w:r>
+                  <w:rPr>
+                    <w:noProof/>
+                    <w:webHidden/>
+                  </w:rPr>
+                  <w:fldChar w:fldCharType="separate"/>
+                </w:r>
+                <w:r>
+                  <w:rPr>
+                    <w:noProof/>
+                    <w:webHidden/>
+                  </w:rPr>
+                  <w:t>10</w:t>
+                </w:r>
+                <w:r>
+                  <w:rPr>
+                    <w:noProof/>
+                    <w:webHidden/>
+                  </w:rPr>
+                  <w:fldChar w:fldCharType="end"/>
+                </w:r>
+              </w:hyperlink>
+            </w:p>
+            <w:p>
+              <w:r>
+                <w:rPr>
+                  <w:b/>
+                  <w:bCs/>
+                </w:rPr>
+                <w:fldChar w:fldCharType="end"/>
+              </w:r>
+            </w:p>
+          </w:sdtContent>
+        </w:sdt>
         <w:p>
           <w:pPr>
             <w:rPr>
@@ -99,10 +1354,12 @@
               <w:numId w:val="1"/>
             </w:numPr>
           </w:pPr>
+          <w:bookmarkStart w:id="0" w:name="_Toc229437719"/>
           <w:r>
             <w:lastRenderedPageBreak/>
             <w:t>Účel aplikace</w:t>
           </w:r>
+          <w:bookmarkEnd w:id="0"/>
         </w:p>
         <w:p>
           <w:r>
@@ -141,10 +1398,12 @@
               <w:numId w:val="1"/>
             </w:numPr>
           </w:pPr>
+          <w:bookmarkStart w:id="1" w:name="_Toc229437720"/>
           <w:r>
             <w:lastRenderedPageBreak/>
             <w:t>Implementované případy užití</w:t>
           </w:r>
+          <w:bookmarkEnd w:id="1"/>
         </w:p>
         <w:p>
           <w:r>
@@ -180,7 +1439,7 @@
             <mc:AlternateContent>
               <mc:Choice Requires="wps">
                 <w:drawing>
-                  <wp:anchor distT="0" distB="0" distL="114300" distR="114300" simplePos="0" relativeHeight="251660288" behindDoc="0" locked="0" layoutInCell="1" allowOverlap="1" wp14:anchorId="3B17B369" wp14:editId="530B55CB">
+                  <wp:anchor distT="0" distB="0" distL="114300" distR="114300" simplePos="0" relativeHeight="251659264" behindDoc="0" locked="0" layoutInCell="1" allowOverlap="1" wp14:anchorId="3B17B369" wp14:editId="2AD3BF3B">
                     <wp:simplePos x="0" y="0"/>
                     <wp:positionH relativeFrom="column">
                       <wp:posOffset>913130</wp:posOffset>
@@ -266,7 +1525,7 @@
                     <v:stroke joinstyle="miter"/>
                     <v:path gradientshapeok="t" o:connecttype="rect"/>
                   </v:shapetype>
-                  <v:shape id="Text Box 1" o:spid="_x0000_s1026" type="#_x0000_t202" style="position:absolute;left:0;text-align:left;margin-left:71.9pt;margin-top:287.9pt;width:307.55pt;height:.05pt;z-index:251660288;visibility:visible;mso-wrap-style:square;mso-wrap-distance-left:9pt;mso-wrap-distance-top:0;mso-wrap-distance-right:9pt;mso-wrap-distance-bottom:0;mso-position-horizontal:absolute;mso-position-horizontal-relative:text;mso-position-vertical:absolute;mso-position-vertical-relative:text;v-text-anchor:top" o:gfxdata="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" stroked="f">
+                  <v:shape id="Text Box 1" o:spid="_x0000_s1026" type="#_x0000_t202" style="position:absolute;left:0;text-align:left;margin-left:71.9pt;margin-top:287.9pt;width:307.55pt;height:.05pt;z-index:251659264;visibility:visible;mso-wrap-style:square;mso-wrap-distance-left:9pt;mso-wrap-distance-top:0;mso-wrap-distance-right:9pt;mso-wrap-distance-bottom:0;mso-position-horizontal:absolute;mso-position-horizontal-relative:text;mso-position-vertical:absolute;mso-position-vertical-relative:text;v-text-anchor:top" o:gfxdata="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" stroked="f">
                     <v:textbox style="mso-fit-shape-to-text:t" inset="0,0,0,0">
                       <w:txbxContent>
                         <w:p>
@@ -314,7 +1573,7 @@
               <w:noProof/>
             </w:rPr>
             <w:drawing>
-              <wp:anchor distT="0" distB="0" distL="114300" distR="114300" simplePos="0" relativeHeight="251658240" behindDoc="0" locked="0" layoutInCell="1" allowOverlap="1" wp14:anchorId="68962BB6" wp14:editId="4B849E72">
+              <wp:anchor distT="0" distB="0" distL="114300" distR="114300" simplePos="0" relativeHeight="251657216" behindDoc="0" locked="0" layoutInCell="1" allowOverlap="1" wp14:anchorId="68962BB6" wp14:editId="568AEDDB">
                 <wp:simplePos x="0" y="0"/>
                 <wp:positionH relativeFrom="margin">
                   <wp:align>center</wp:align>
@@ -337,7 +1596,7 @@
                         <pic:cNvPicPr/>
                       </pic:nvPicPr>
                       <pic:blipFill>
-                        <a:blip r:embed="rId7">
+                        <a:blip r:embed="rId8">
                           <a:extLst>
                             <a:ext uri="{28A0092B-C50C-407E-A947-70E740481C1C}">
                               <a14:useLocalDpi xmlns:a14="http://schemas.microsoft.com/office/drawing/2010/main" val="0"/>
@@ -397,10 +1656,12 @@
               <w:numId w:val="1"/>
             </w:numPr>
           </w:pPr>
+          <w:bookmarkStart w:id="2" w:name="_Toc229437721"/>
           <w:r>
             <w:lastRenderedPageBreak/>
             <w:t>Architektura a návrh</w:t>
           </w:r>
+          <w:bookmarkEnd w:id="2"/>
         </w:p>
         <w:p>
           <w:pPr>
@@ -410,9 +1671,11 @@
               <w:numId w:val="1"/>
             </w:numPr>
           </w:pPr>
+          <w:bookmarkStart w:id="3" w:name="_Toc229437722"/>
           <w:r>
             <w:t>Datový model</w:t>
           </w:r>
+          <w:bookmarkEnd w:id="3"/>
         </w:p>
         <w:p>
           <w:r>
@@ -431,7 +1694,15 @@
             <w:t>Pacient</w:t>
           </w:r>
           <w:r>
-            <w:t xml:space="preserve"> (Patient)</w:t>
+            <w:t xml:space="preserve"> (</w:t>
+          </w:r>
+          <w:proofErr w:type="spellStart"/>
+          <w:r>
+            <w:t>Patient</w:t>
+          </w:r>
+          <w:proofErr w:type="spellEnd"/>
+          <w:r>
+            <w:t>)</w:t>
           </w:r>
           <w:r>
             <w:t xml:space="preserve"> – uchovává základní osobní údaje pacienta, jako je rodné číslo, jméno, příjmení, adresa, číslo pojišťovny, telefonní číslo (kontakt důležitý v reálném provozu pro zasílání eReceptů) a datum narození a zaznamenává vazby s ostatními souvisejícími entitami</w:t>
@@ -452,7 +1723,15 @@
             <w:t>Diagnóza</w:t>
           </w:r>
           <w:r>
-            <w:t xml:space="preserve"> (Diagnosis)</w:t>
+            <w:t xml:space="preserve"> (</w:t>
+          </w:r>
+          <w:proofErr w:type="spellStart"/>
+          <w:r>
+            <w:t>Diagnosis</w:t>
+          </w:r>
+          <w:proofErr w:type="spellEnd"/>
+          <w:r>
+            <w:t>)</w:t>
           </w:r>
           <w:r>
             <w:t xml:space="preserve"> – pomocná entita uchovávající název diagnózy, případně by mohla obsahovat ještě její</w:t>
@@ -473,7 +1752,219 @@
             </w:numPr>
           </w:pPr>
           <w:r>
-            <w:t>Diagnostický záznam (DiagnostiRecord) – uchovává vedle konkrétní diagnózy ještě stručný popis a datum, kdy byla pacientov</w:t>
+            <w:rPr>
+              <w:noProof/>
+            </w:rPr>
+            <mc:AlternateContent>
+              <mc:Choice Requires="wps">
+                <w:drawing>
+                  <wp:anchor distT="0" distB="0" distL="114300" distR="114300" simplePos="0" relativeHeight="251673600" behindDoc="0" locked="0" layoutInCell="1" allowOverlap="1" wp14:anchorId="07FDCC1C" wp14:editId="1B5B6886">
+                    <wp:simplePos x="0" y="0"/>
+                    <wp:positionH relativeFrom="column">
+                      <wp:posOffset>3938270</wp:posOffset>
+                    </wp:positionH>
+                    <wp:positionV relativeFrom="paragraph">
+                      <wp:posOffset>3334385</wp:posOffset>
+                    </wp:positionV>
+                    <wp:extent cx="1824355" cy="635"/>
+                    <wp:effectExtent l="0" t="0" r="0" b="0"/>
+                    <wp:wrapSquare wrapText="bothSides"/>
+                    <wp:docPr id="504636143" name="Text Box 1"/>
+                    <wp:cNvGraphicFramePr/>
+                    <a:graphic xmlns:a="http://schemas.openxmlformats.org/drawingml/2006/main">
+                      <a:graphicData uri="http://schemas.microsoft.com/office/word/2010/wordprocessingShape">
+                        <wps:wsp>
+                          <wps:cNvSpPr txBox="1"/>
+                          <wps:spPr>
+                            <a:xfrm>
+                              <a:off x="0" y="0"/>
+                              <a:ext cx="1824355" cy="635"/>
+                            </a:xfrm>
+                            <a:prstGeom prst="rect">
+                              <a:avLst/>
+                            </a:prstGeom>
+                            <a:solidFill>
+                              <a:prstClr val="white"/>
+                            </a:solidFill>
+                            <a:ln>
+                              <a:noFill/>
+                            </a:ln>
+                          </wps:spPr>
+                          <wps:txbx>
+                            <w:txbxContent>
+                              <w:p>
+                                <w:pPr>
+                                  <w:pStyle w:val="Caption"/>
+                                  <w:ind w:left="720" w:firstLine="0"/>
+                                  <w:rPr>
+                                    <w:noProof/>
+                                  </w:rPr>
+                                </w:pPr>
+                                <w:r>
+                                  <w:t xml:space="preserve">Obrázek </w:t>
+                                </w:r>
+                                <w:r>
+                                  <w:fldChar w:fldCharType="begin"/>
+                                </w:r>
+                                <w:r>
+                                  <w:instrText xml:space="preserve"> SEQ Obrázek \* ARABIC </w:instrText>
+                                </w:r>
+                                <w:r>
+                                  <w:fldChar w:fldCharType="separate"/>
+                                </w:r>
+                                <w:r>
+                                  <w:rPr>
+                                    <w:noProof/>
+                                  </w:rPr>
+                                  <w:t>2</w:t>
+                                </w:r>
+                                <w:r>
+                                  <w:fldChar w:fldCharType="end"/>
+                                </w:r>
+                                <w:r>
+                                  <w:t xml:space="preserve">:Stavový diagram pracovní </w:t>
+                                </w:r>
+                                <w:proofErr w:type="spellStart"/>
+                                <w:r>
+                                  <w:t>nechopnosti</w:t>
+                                </w:r>
+                                <w:proofErr w:type="spellEnd"/>
+                              </w:p>
+                            </w:txbxContent>
+                          </wps:txbx>
+                          <wps:bodyPr rot="0" spcFirstLastPara="0" vertOverflow="overflow" horzOverflow="overflow" vert="horz" wrap="square" lIns="0" tIns="0" rIns="0" bIns="0" numCol="1" spcCol="0" rtlCol="0" fromWordArt="0" anchor="t" anchorCtr="0" forceAA="0" compatLnSpc="1">
+                            <a:prstTxWarp prst="textNoShape">
+                              <a:avLst/>
+                            </a:prstTxWarp>
+                            <a:spAutoFit/>
+                          </wps:bodyPr>
+                        </wps:wsp>
+                      </a:graphicData>
+                    </a:graphic>
+                  </wp:anchor>
+                </w:drawing>
+              </mc:Choice>
+              <mc:Fallback>
+                <w:pict>
+                  <v:shape w14:anchorId="07FDCC1C" id="_x0000_s1027" type="#_x0000_t202" style="position:absolute;left:0;text-align:left;margin-left:310.1pt;margin-top:262.55pt;width:143.65pt;height:.05pt;z-index:251673600;visibility:visible;mso-wrap-style:square;mso-wrap-distance-left:9pt;mso-wrap-distance-top:0;mso-wrap-distance-right:9pt;mso-wrap-distance-bottom:0;mso-position-horizontal:absolute;mso-position-horizontal-relative:text;mso-position-vertical:absolute;mso-position-vertical-relative:text;v-text-anchor:top" o:gfxdata="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" stroked="f">
+                    <v:textbox style="mso-fit-shape-to-text:t" inset="0,0,0,0">
+                      <w:txbxContent>
+                        <w:p>
+                          <w:pPr>
+                            <w:pStyle w:val="Caption"/>
+                            <w:ind w:left="720" w:firstLine="0"/>
+                            <w:rPr>
+                              <w:noProof/>
+                            </w:rPr>
+                          </w:pPr>
+                          <w:r>
+                            <w:t xml:space="preserve">Obrázek </w:t>
+                          </w:r>
+                          <w:r>
+                            <w:fldChar w:fldCharType="begin"/>
+                          </w:r>
+                          <w:r>
+                            <w:instrText xml:space="preserve"> SEQ Obrázek \* ARABIC </w:instrText>
+                          </w:r>
+                          <w:r>
+                            <w:fldChar w:fldCharType="separate"/>
+                          </w:r>
+                          <w:r>
+                            <w:rPr>
+                              <w:noProof/>
+                            </w:rPr>
+                            <w:t>2</w:t>
+                          </w:r>
+                          <w:r>
+                            <w:fldChar w:fldCharType="end"/>
+                          </w:r>
+                          <w:r>
+                            <w:t xml:space="preserve">:Stavový diagram pracovní </w:t>
+                          </w:r>
+                          <w:proofErr w:type="spellStart"/>
+                          <w:r>
+                            <w:t>nechopnosti</w:t>
+                          </w:r>
+                          <w:proofErr w:type="spellEnd"/>
+                        </w:p>
+                      </w:txbxContent>
+                    </v:textbox>
+                    <w10:wrap type="square"/>
+                  </v:shape>
+                </w:pict>
+              </mc:Fallback>
+            </mc:AlternateContent>
+          </w:r>
+          <w:r>
+            <w:rPr>
+              <w:noProof/>
+            </w:rPr>
+            <w:drawing>
+              <wp:anchor distT="0" distB="0" distL="114300" distR="114300" simplePos="0" relativeHeight="251671552" behindDoc="0" locked="0" layoutInCell="1" allowOverlap="1" wp14:anchorId="502D4834" wp14:editId="04B12815">
+                <wp:simplePos x="0" y="0"/>
+                <wp:positionH relativeFrom="column">
+                  <wp:posOffset>3938270</wp:posOffset>
+                </wp:positionH>
+                <wp:positionV relativeFrom="paragraph">
+                  <wp:posOffset>486410</wp:posOffset>
+                </wp:positionV>
+                <wp:extent cx="1824355" cy="2790825"/>
+                <wp:effectExtent l="0" t="0" r="4445" b="9525"/>
+                <wp:wrapSquare wrapText="bothSides"/>
+                <wp:docPr id="887089269" name="Picture 5"/>
+                <wp:cNvGraphicFramePr>
+                  <a:graphicFrameLocks xmlns:a="http://schemas.openxmlformats.org/drawingml/2006/main" noChangeAspect="1"/>
+                </wp:cNvGraphicFramePr>
+                <a:graphic xmlns:a="http://schemas.openxmlformats.org/drawingml/2006/main">
+                  <a:graphicData uri="http://schemas.openxmlformats.org/drawingml/2006/picture">
+                    <pic:pic xmlns:pic="http://schemas.openxmlformats.org/drawingml/2006/picture">
+                      <pic:nvPicPr>
+                        <pic:cNvPr id="887089269" name="Picture 887089269"/>
+                        <pic:cNvPicPr/>
+                      </pic:nvPicPr>
+                      <pic:blipFill>
+                        <a:blip r:embed="rId9">
+                          <a:extLst>
+                            <a:ext uri="{28A0092B-C50C-407E-A947-70E740481C1C}">
+                              <a14:useLocalDpi xmlns:a14="http://schemas.microsoft.com/office/drawing/2010/main" val="0"/>
+                            </a:ext>
+                          </a:extLst>
+                        </a:blip>
+                        <a:stretch>
+                          <a:fillRect/>
+                        </a:stretch>
+                      </pic:blipFill>
+                      <pic:spPr>
+                        <a:xfrm>
+                          <a:off x="0" y="0"/>
+                          <a:ext cx="1824355" cy="2790825"/>
+                        </a:xfrm>
+                        <a:prstGeom prst="rect">
+                          <a:avLst/>
+                        </a:prstGeom>
+                      </pic:spPr>
+                    </pic:pic>
+                  </a:graphicData>
+                </a:graphic>
+                <wp14:sizeRelH relativeFrom="margin">
+                  <wp14:pctWidth>0</wp14:pctWidth>
+                </wp14:sizeRelH>
+                <wp14:sizeRelV relativeFrom="margin">
+                  <wp14:pctHeight>0</wp14:pctHeight>
+                </wp14:sizeRelV>
+              </wp:anchor>
+            </w:drawing>
+          </w:r>
+          <w:r>
+            <w:t>Diagnostický záznam (</w:t>
+          </w:r>
+          <w:proofErr w:type="spellStart"/>
+          <w:r>
+            <w:t>DiagnostiRecord</w:t>
+          </w:r>
+          <w:proofErr w:type="spellEnd"/>
+          <w:r>
+            <w:t>) – uchovává vedle konkrétní diagnózy ještě stručný popis a datum, kdy byla pacientov</w:t>
           </w:r>
           <w:r>
             <w:t>i</w:t>
@@ -494,7 +1985,15 @@
             </w:numPr>
           </w:pPr>
           <w:r>
-            <w:t>Léčivo (Medication) – pomocná entita uchovávající název léčiva, jeho léčivou látku a formu</w:t>
+            <w:t>Léčivo (</w:t>
+          </w:r>
+          <w:proofErr w:type="spellStart"/>
+          <w:r>
+            <w:t>Medication</w:t>
+          </w:r>
+          <w:proofErr w:type="spellEnd"/>
+          <w:r>
+            <w:t>) – pomocná entita uchovávající název léčiva, jeho léčivou látku a formu</w:t>
           </w:r>
           <w:r>
             <w:t>;</w:t>
@@ -509,7 +2008,15 @@
             </w:numPr>
           </w:pPr>
           <w:r>
-            <w:t>Předpis (Prescription) – uchovává konkrétní léčivo, datum, kdy bylo pacientovi předepsáno a komentář například týkající se dávkováni. Každý pacient může mít více předpisů</w:t>
+            <w:t>Předpis (</w:t>
+          </w:r>
+          <w:proofErr w:type="spellStart"/>
+          <w:r>
+            <w:t>Prescription</w:t>
+          </w:r>
+          <w:proofErr w:type="spellEnd"/>
+          <w:r>
+            <w:t>) – uchovává konkrétní léčivo, datum, kdy bylo pacientovi předepsáno a komentář například týkající se dávkováni. Každý pacient může mít více předpisů</w:t>
           </w:r>
           <w:r>
             <w:t>;</w:t>
@@ -524,22 +2031,54 @@
             </w:numPr>
           </w:pPr>
           <w:r>
+            <w:t>Pracovní neschopnost (</w:t>
+          </w:r>
+          <w:proofErr w:type="spellStart"/>
+          <w:r>
+            <w:t>SicknessCertificate</w:t>
+          </w:r>
+          <w:proofErr w:type="spellEnd"/>
+          <w:r>
+            <w:t xml:space="preserve">) – </w:t>
+          </w:r>
+          <w:proofErr w:type="spellStart"/>
+          <w:r>
+            <w:t>uchováv</w:t>
+          </w:r>
+          <w:proofErr w:type="spellEnd"/>
+          <w:r>
+            <w:t xml:space="preserve"> datum vystavení, datum ukončení (pokud již byla ukončena), zaměstnavatele a aktivní adresu, tedy adresu, kde bude pacient po dobu jejího trvání pobývat.</w:t>
+          </w:r>
+          <w:r>
+            <w:t xml:space="preserve"> Každý pacient může mít více pracovních neschopností;</w:t>
+          </w:r>
+        </w:p>
+        <w:p>
+          <w:pPr>
+            <w:pStyle w:val="ListParagraph"/>
+            <w:numPr>
+              <w:ilvl w:val="0"/>
+              <w:numId w:val="2"/>
+            </w:numPr>
+          </w:pPr>
+          <w:r>
             <w:rPr>
               <w:noProof/>
             </w:rPr>
+            <w:lastRenderedPageBreak/>
             <mc:AlternateContent>
               <mc:Choice Requires="wps">
                 <w:drawing>
-                  <wp:anchor distT="0" distB="0" distL="114300" distR="114300" simplePos="0" relativeHeight="251665408" behindDoc="0" locked="0" layoutInCell="1" allowOverlap="1" wp14:anchorId="3DB31833" wp14:editId="2F04595B">
+                  <wp:anchor distT="0" distB="0" distL="114300" distR="114300" simplePos="0" relativeHeight="251664384" behindDoc="0" locked="0" layoutInCell="1" allowOverlap="1" wp14:anchorId="3DB31833" wp14:editId="1B388482">
                     <wp:simplePos x="0" y="0"/>
-                    <wp:positionH relativeFrom="column">
-                      <wp:posOffset>738505</wp:posOffset>
+                    <wp:positionH relativeFrom="margin">
+                      <wp:align>center</wp:align>
                     </wp:positionH>
                     <wp:positionV relativeFrom="paragraph">
-                      <wp:posOffset>4339590</wp:posOffset>
+                      <wp:posOffset>4070350</wp:posOffset>
                     </wp:positionV>
                     <wp:extent cx="4254500" cy="635"/>
-                    <wp:effectExtent l="0" t="0" r="0" b="0"/>
+                    <wp:effectExtent l="0" t="0" r="0" b="8255"/>
                     <wp:wrapTopAndBottom/>
                     <wp:docPr id="1461641792" name="Text Box 1"/>
                     <wp:cNvGraphicFramePr/>
@@ -587,7 +2126,7 @@
                                   <w:rPr>
                                     <w:noProof/>
                                   </w:rPr>
-                                  <w:t>2</w:t>
+                                  <w:t>3</w:t>
                                 </w:r>
                                 <w:r>
                                   <w:fldChar w:fldCharType="end"/>
@@ -612,7 +2151,7 @@
               </mc:Choice>
               <mc:Fallback>
                 <w:pict>
-                  <v:shape w14:anchorId="3DB31833" id="_x0000_s1027" type="#_x0000_t202" style="position:absolute;left:0;text-align:left;margin-left:58.15pt;margin-top:341.7pt;width:335pt;height:.05pt;z-index:251665408;visibility:visible;mso-wrap-style:square;mso-wrap-distance-left:9pt;mso-wrap-distance-top:0;mso-wrap-distance-right:9pt;mso-wrap-distance-bottom:0;mso-position-horizontal:absolute;mso-position-horizontal-relative:text;mso-position-vertical:absolute;mso-position-vertical-relative:text;v-text-anchor:top" o:gfxdata="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" stroked="f">
+                  <v:shape w14:anchorId="3DB31833" id="_x0000_s1028" type="#_x0000_t202" style="position:absolute;left:0;text-align:left;margin-left:0;margin-top:320.5pt;width:335pt;height:.05pt;z-index:251664384;visibility:visible;mso-wrap-style:square;mso-wrap-distance-left:9pt;mso-wrap-distance-top:0;mso-wrap-distance-right:9pt;mso-wrap-distance-bottom:0;mso-position-horizontal:center;mso-position-horizontal-relative:margin;mso-position-vertical:absolute;mso-position-vertical-relative:text;v-text-anchor:top" o:gfxdata="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" stroked="f">
                     <v:textbox style="mso-fit-shape-to-text:t" inset="0,0,0,0">
                       <w:txbxContent>
                         <w:p>
@@ -638,7 +2177,7 @@
                             <w:rPr>
                               <w:noProof/>
                             </w:rPr>
-                            <w:t>2</w:t>
+                            <w:t>3</w:t>
                           </w:r>
                           <w:r>
                             <w:fldChar w:fldCharType="end"/>
@@ -649,7 +2188,7 @@
                         </w:p>
                       </w:txbxContent>
                     </v:textbox>
-                    <w10:wrap type="topAndBottom"/>
+                    <w10:wrap type="topAndBottom" anchorx="margin"/>
                   </v:shape>
                 </w:pict>
               </mc:Fallback>
@@ -660,15 +2199,15 @@
               <w:noProof/>
             </w:rPr>
             <w:drawing>
-              <wp:anchor distT="0" distB="0" distL="114300" distR="114300" simplePos="0" relativeHeight="251661312" behindDoc="0" locked="0" layoutInCell="1" allowOverlap="1" wp14:anchorId="2F696489" wp14:editId="392BF4B0">
+              <wp:anchor distT="0" distB="0" distL="114300" distR="114300" simplePos="0" relativeHeight="251660288" behindDoc="0" locked="0" layoutInCell="1" allowOverlap="1" wp14:anchorId="2F696489" wp14:editId="185BF7A7">
                 <wp:simplePos x="0" y="0"/>
                 <wp:positionH relativeFrom="margin">
-                  <wp:align>center</wp:align>
+                  <wp:posOffset>738505</wp:posOffset>
                 </wp:positionH>
                 <wp:positionV relativeFrom="paragraph">
-                  <wp:posOffset>850489</wp:posOffset>
+                  <wp:posOffset>581025</wp:posOffset>
                 </wp:positionV>
-                <wp:extent cx="4254867" cy="3452426"/>
+                <wp:extent cx="4254500" cy="3451860"/>
                 <wp:effectExtent l="0" t="0" r="0" b="0"/>
                 <wp:wrapTopAndBottom/>
                 <wp:docPr id="200308659" name="Picture 2"/>
@@ -683,7 +2222,7 @@
                         <pic:cNvPicPr/>
                       </pic:nvPicPr>
                       <pic:blipFill>
-                        <a:blip r:embed="rId8">
+                        <a:blip r:embed="rId10">
                           <a:extLst>
                             <a:ext uri="{28A0092B-C50C-407E-A947-70E740481C1C}">
                               <a14:useLocalDpi xmlns:a14="http://schemas.microsoft.com/office/drawing/2010/main" val="0"/>
@@ -697,7 +2236,7 @@
                       <pic:spPr>
                         <a:xfrm>
                           <a:off x="0" y="0"/>
-                          <a:ext cx="4254867" cy="3452426"/>
+                          <a:ext cx="4254500" cy="3451860"/>
                         </a:xfrm>
                         <a:prstGeom prst="rect">
                           <a:avLst/>
@@ -716,24 +2255,22 @@
             </w:drawing>
           </w:r>
           <w:r>
-            <w:t>Pracovní neschopnost (SicknessCertificate) – uchováv datum vystavení, datum ukončení (pokud již byla ukončena), zaměstnavatele a aktivní adresu, tedy adresu, kde bude pacient po dobu jejího trvání pobývat.</w:t>
-          </w:r>
-          <w:r>
-            <w:t xml:space="preserve"> Každý pacient může mít více pracovních neschopností;</w:t>
+            <w:t>Interakce (</w:t>
+          </w:r>
+          <w:proofErr w:type="spellStart"/>
+          <w:r>
+            <w:t>Interaction</w:t>
+          </w:r>
+          <w:proofErr w:type="spellEnd"/>
+          <w:r>
+            <w:t>) – entita irelevantní pro implementovanou část aplikace uchovávající interagující léčiva a popis interakce.</w:t>
           </w:r>
         </w:p>
         <w:p>
           <w:pPr>
             <w:pStyle w:val="ListParagraph"/>
-            <w:numPr>
-              <w:ilvl w:val="0"/>
-              <w:numId w:val="2"/>
-            </w:numPr>
+            <w:ind w:left="1440" w:firstLine="0"/>
           </w:pPr>
-          <w:r>
-            <w:lastRenderedPageBreak/>
-            <w:t>Interakce (Interaction) – entita irelevantní pro implementovanou část aplikace uchovávající interagující léčiva a popis interakce.</w:t>
-          </w:r>
         </w:p>
         <w:p>
           <w:pPr>
@@ -743,13 +2280,63 @@
               <w:numId w:val="1"/>
             </w:numPr>
           </w:pPr>
+          <w:bookmarkStart w:id="4" w:name="_Toc229437723"/>
           <w:r>
             <w:t>Softwarová architektura</w:t>
           </w:r>
+          <w:bookmarkEnd w:id="4"/>
         </w:p>
         <w:p>
           <w:r>
-            <w:t>Pro celou aplikaci byl použit návrhový vzor WebMVC umožňující oddělení datové vrstvy od řídící logiky a interakce s uživatelem. Na rozdíl od běžného MVC jsou pohledy (View) pasivní a pouze zobrazují již rozparsovaná data od kontrolerů (Controller) a umožňují zadávání dat, které následně zpracovává kontroler a případně je předává do datové vrstvy (Model) pro uložení do databáze</w:t>
+            <w:t xml:space="preserve">Pro celou aplikaci byl použit návrhový vzor </w:t>
+          </w:r>
+          <w:proofErr w:type="spellStart"/>
+          <w:r>
+            <w:t>WebMVC</w:t>
+          </w:r>
+          <w:proofErr w:type="spellEnd"/>
+          <w:r>
+            <w:t xml:space="preserve"> umožňující oddělení datové vrstvy od řídící logiky a interakce s uživatelem. Na rozdíl od běžného MVC jsou pohledy (</w:t>
+          </w:r>
+          <w:proofErr w:type="spellStart"/>
+          <w:r>
+            <w:t>View</w:t>
+          </w:r>
+          <w:proofErr w:type="spellEnd"/>
+          <w:r>
+            <w:t xml:space="preserve">) pasivní a pouze zobrazují již </w:t>
+          </w:r>
+          <w:proofErr w:type="spellStart"/>
+          <w:r>
+            <w:t>rozparsovaná</w:t>
+          </w:r>
+          <w:proofErr w:type="spellEnd"/>
+          <w:r>
+            <w:t xml:space="preserve"> data od </w:t>
+          </w:r>
+          <w:proofErr w:type="spellStart"/>
+          <w:r>
+            <w:t>kontrolerů</w:t>
+          </w:r>
+          <w:proofErr w:type="spellEnd"/>
+          <w:r>
+            <w:t xml:space="preserve"> (</w:t>
+          </w:r>
+          <w:proofErr w:type="spellStart"/>
+          <w:r>
+            <w:t>Controller</w:t>
+          </w:r>
+          <w:proofErr w:type="spellEnd"/>
+          <w:r>
+            <w:t xml:space="preserve">) a umožňují zadávání dat, které následně zpracovává </w:t>
+          </w:r>
+          <w:proofErr w:type="spellStart"/>
+          <w:r>
+            <w:t>kontroler</w:t>
+          </w:r>
+          <w:proofErr w:type="spellEnd"/>
+          <w:r>
+            <w:t xml:space="preserve"> a případně je předává do datové vrstvy (Model) pro uložení do databáze</w:t>
           </w:r>
           <w:r>
             <w:t>, architektura se tedy blíží MVP</w:t>
@@ -762,24 +2349,79 @@
           <w:pPr>
             <w:pStyle w:val="Heading3"/>
           </w:pPr>
-          <w:r>
-            <w:t>3.2.1 Kontrolery</w:t>
-          </w:r>
+          <w:bookmarkStart w:id="5" w:name="_Toc229437724"/>
+          <w:r>
+            <w:t xml:space="preserve">3.2.1 </w:t>
+          </w:r>
+          <w:proofErr w:type="spellStart"/>
+          <w:r>
+            <w:t>Kontrolery</w:t>
+          </w:r>
+          <w:bookmarkEnd w:id="5"/>
+          <w:proofErr w:type="spellEnd"/>
         </w:p>
         <w:p>
           <w:r>
-            <w:t>Třídy kontrolerů obsahují metody pro načítání a seskupování dat pro zobrazení, zobrazování patřičných pohledů, ale i zpracování dat obdržených od uživatele. Načítání, vytváření a úpravu dat provádějí prostřednictvím komunikace s databázovými modely, se kterými si předávají přepravky (DTO – Data Transfer Object). Zajišťují veškerou nejdůležitější aplikační logiku.</w:t>
+            <w:t xml:space="preserve">Třídy </w:t>
+          </w:r>
+          <w:proofErr w:type="spellStart"/>
+          <w:r>
+            <w:t>kontrolerů</w:t>
+          </w:r>
+          <w:proofErr w:type="spellEnd"/>
+          <w:r>
+            <w:t xml:space="preserve"> obsahují metody pro načítání a seskupování dat pro zobrazení, zobrazování patřičných pohledů, ale i zpracování dat obdržených od uživatele. Načítání, vytváření a úpravu dat provádějí prostřednictvím komunikace s databázovými modely, se kterými si předávají přepravky (DTO – Data Transfer </w:t>
+          </w:r>
+          <w:proofErr w:type="spellStart"/>
+          <w:r>
+            <w:t>Object</w:t>
+          </w:r>
+          <w:proofErr w:type="spellEnd"/>
+          <w:r>
+            <w:t>). Zajišťují veškerou nejdůležitější aplikační logiku.</w:t>
           </w:r>
         </w:p>
         <w:p>
           <w:r>
-            <w:t xml:space="preserve">Speciálním kontrolerem je poté router index.php, který je rozcestníkem volajícím metody ostatních kontrolerů na základě akcí, které chce uživatel provádět. </w:t>
+            <w:t xml:space="preserve">Speciálním </w:t>
+          </w:r>
+          <w:proofErr w:type="spellStart"/>
+          <w:r>
+            <w:t>kontrolerem</w:t>
+          </w:r>
+          <w:proofErr w:type="spellEnd"/>
+          <w:r>
+            <w:t xml:space="preserve"> je poté router </w:t>
+          </w:r>
+          <w:proofErr w:type="spellStart"/>
+          <w:r>
+            <w:t>index.php</w:t>
+          </w:r>
+          <w:proofErr w:type="spellEnd"/>
+          <w:r>
+            <w:t xml:space="preserve">, který je rozcestníkem volajícím metody ostatních </w:t>
+          </w:r>
+          <w:proofErr w:type="spellStart"/>
+          <w:r>
+            <w:t>kontrolerů</w:t>
+          </w:r>
+          <w:proofErr w:type="spellEnd"/>
+          <w:r>
+            <w:t xml:space="preserve"> na základě akcí, které chce uživatel provádět. </w:t>
           </w:r>
           <w:r>
             <w:t>Vytváří</w:t>
           </w:r>
           <w:r>
-            <w:t xml:space="preserve"> instance nejen kontrolerů, ale také databázových modelů, které předává konstruktorům složitějších objektů pro manipulaci s daty a právě konstruktorů</w:t>
+            <w:t xml:space="preserve"> instance nejen </w:t>
+          </w:r>
+          <w:proofErr w:type="spellStart"/>
+          <w:r>
+            <w:t>kontrolerů</w:t>
+          </w:r>
+          <w:proofErr w:type="spellEnd"/>
+          <w:r>
+            <w:t>, ale také databázových modelů, které předává konstruktorům složitějších objektů pro manipulaci s daty a právě konstruktorů</w:t>
           </w:r>
           <w:r>
             <w:t>, funguje tedy jako skladba aplikace</w:t>
@@ -788,47 +2430,105 @@
             <w:t>.</w:t>
           </w:r>
           <w:r>
-            <w:t xml:space="preserve"> Základní kontrolery aplikace jsou čtyři: pro práci s pacienty, diagnózami, léčivy a neschopenkami.</w:t>
+            <w:t xml:space="preserve"> Základní </w:t>
+          </w:r>
+          <w:proofErr w:type="spellStart"/>
+          <w:r>
+            <w:t>kontrolery</w:t>
+          </w:r>
+          <w:proofErr w:type="spellEnd"/>
+          <w:r>
+            <w:t xml:space="preserve"> aplikace jsou čtyři: pro práci s pacienty, diagnózami, léčivy a neschopenkami.</w:t>
           </w:r>
         </w:p>
         <w:p>
           <w:pPr>
             <w:pStyle w:val="Heading3"/>
           </w:pPr>
-          <w:r>
+          <w:bookmarkStart w:id="6" w:name="_Toc229437725"/>
+          <w:r>
+            <w:lastRenderedPageBreak/>
             <w:t>3.2.2. Datová vrstva</w:t>
           </w:r>
+          <w:bookmarkEnd w:id="6"/>
         </w:p>
         <w:p>
           <w:r>
-            <w:t>Přístup do databáze zajišťují modely (DAO – Data Access Object) pro každou databázovou tabulku jeden, zastávají tak vkládání nových záznamů, čtení a úpravu již existujících. Ke všem DAO třídám je vytvořeno rozhraní pro zajištění co největší nezávislosti na konkrétním způsobu uložení dat.</w:t>
+            <w:t xml:space="preserve">Přístup do databáze zajišťují modely (DAO – Data Access </w:t>
+          </w:r>
+          <w:proofErr w:type="spellStart"/>
+          <w:r>
+            <w:t>Object</w:t>
+          </w:r>
+          <w:proofErr w:type="spellEnd"/>
+          <w:r>
+            <w:t>) pro každou databázovou tabulku jeden, zastávají tak vkládání nových záznamů, čtení a úpravu již existujících. Ke všem DAO třídám je vytvořeno rozhraní pro zajištění co největší nezávislosti na konkrétním způsobu uložení dat.</w:t>
           </w:r>
         </w:p>
         <w:p>
           <w:r>
-            <w:t>Pro složitější entity pacient, diagnóza a předpis jsou vytvořeny ještě třídy typu Repository, které zajišťují korektní získání kompletní entity z databáze. V případě diagnózy a předpisu byly z důvodů efektivity</w:t>
-          </w:r>
-          <w:r>
-            <w:t xml:space="preserve"> porušeny zásady návrhového vzoru Repository a tyto třídy přistupují přímo do databáze. Pokud by tomu tak nebylo, muselo by se pro každý jednotlivý předpis, či diagnózu přistupovat zvlášť do databáze, čímž by se při škálování aplikace výrazně zhoršoval výkon. Takto bylo využito efektivní SQL operace JOIN a pro omezení závislosti na konkrétní databázi byla vytvořena rozhraní.</w:t>
+            <w:t xml:space="preserve">Pro složitější entity pacient, diagnóza a předpis jsou vytvořeny ještě třídy typu </w:t>
+          </w:r>
+          <w:proofErr w:type="spellStart"/>
+          <w:r>
+            <w:t>Repository</w:t>
+          </w:r>
+          <w:proofErr w:type="spellEnd"/>
+          <w:r>
+            <w:t>, které zajišťují korektní získání kompletní entity z databáze. V případě diagnózy a předpisu byly z důvodů efektivity</w:t>
+          </w:r>
+          <w:r>
+            <w:t xml:space="preserve"> porušeny zásady návrhového vzoru </w:t>
+          </w:r>
+          <w:proofErr w:type="spellStart"/>
+          <w:r>
+            <w:t>Repository</w:t>
+          </w:r>
+          <w:proofErr w:type="spellEnd"/>
+          <w:r>
+            <w:t xml:space="preserve"> a tyto třídy přistupují přímo do databáze. Pokud by tomu tak nebylo, muselo by se pro každý jednotlivý předpis, či diagnózu přistupovat zvlášť do databáze, čímž by se při škálování aplikace výrazně zhoršoval výkon. Takto bylo využito efektivní SQL operace JOIN a pro omezení závislosti na konkrétní databázi byla vytvořena rozhraní.</w:t>
           </w:r>
         </w:p>
         <w:p>
           <w:r>
-            <w:t>Pro uložení dat byla použita relační databáze MariaDB, se kterou aplikace komunikuje pomocí nástroje PDO, který podporuje různé typy databází.</w:t>
+            <w:t xml:space="preserve">Pro uložení dat byla použita relační databáze </w:t>
+          </w:r>
+          <w:proofErr w:type="spellStart"/>
+          <w:r>
+            <w:t>MariaDB</w:t>
+          </w:r>
+          <w:proofErr w:type="spellEnd"/>
+          <w:r>
+            <w:t>, se kterou aplikace komunikuje pomocí nástroje PDO, který podporuje různé typy databází.</w:t>
           </w:r>
         </w:p>
         <w:p>
           <w:pPr>
             <w:pStyle w:val="Heading3"/>
           </w:pPr>
+          <w:bookmarkStart w:id="7" w:name="_Toc229437726"/>
           <w:r>
             <w:t>3.2.3 Pohledy</w:t>
           </w:r>
+          <w:bookmarkEnd w:id="7"/>
         </w:p>
         <w:p>
           <w:r>
-            <w:t>Pohledy jsou tvořeny šablonami systému Twig, ten byl zvolen pro jednoduchost manipulace s daty získanými od kontroleru</w:t>
-          </w:r>
+            <w:t xml:space="preserve">Pohledy jsou tvořeny šablonami systému </w:t>
+          </w:r>
+          <w:proofErr w:type="spellStart"/>
+          <w:r>
+            <w:t>Twig</w:t>
+          </w:r>
+          <w:proofErr w:type="spellEnd"/>
+          <w:r>
+            <w:t xml:space="preserve">, ten byl zvolen pro jednoduchost manipulace s daty získanými od </w:t>
+          </w:r>
+          <w:proofErr w:type="spellStart"/>
+          <w:r>
+            <w:t>kontroleru</w:t>
+          </w:r>
+          <w:proofErr w:type="spellEnd"/>
           <w:r>
             <w:t>. Tento šablonový systém je obzvlášť efektivní z pohledu počtu potřebných řádek kódu pro jednoduché cykly a podmínky.</w:t>
           </w:r>
@@ -841,15 +2541,15 @@
               <w:numId w:val="1"/>
             </w:numPr>
           </w:pPr>
+          <w:bookmarkStart w:id="8" w:name="_Toc229437727"/>
           <w:r>
             <w:rPr>
               <w:noProof/>
             </w:rPr>
-            <w:lastRenderedPageBreak/>
             <mc:AlternateContent>
               <mc:Choice Requires="wps">
                 <w:drawing>
-                  <wp:anchor distT="0" distB="0" distL="114300" distR="114300" simplePos="0" relativeHeight="251668480" behindDoc="0" locked="0" layoutInCell="1" allowOverlap="1" wp14:anchorId="43578619" wp14:editId="7FCA3FD9">
+                  <wp:anchor distT="0" distB="0" distL="114300" distR="114300" simplePos="0" relativeHeight="251667456" behindDoc="0" locked="0" layoutInCell="1" allowOverlap="1" wp14:anchorId="43578619" wp14:editId="51A2A383">
                     <wp:simplePos x="0" y="0"/>
                     <wp:positionH relativeFrom="column">
                       <wp:posOffset>3551555</wp:posOffset>
@@ -907,7 +2607,7 @@
                                   <w:rPr>
                                     <w:noProof/>
                                   </w:rPr>
-                                  <w:t>3</w:t>
+                                  <w:t>4</w:t>
                                 </w:r>
                                 <w:r>
                                   <w:fldChar w:fldCharType="end"/>
@@ -932,7 +2632,7 @@
               </mc:Choice>
               <mc:Fallback>
                 <w:pict>
-                  <v:shape w14:anchorId="43578619" id="_x0000_s1028" type="#_x0000_t202" style="position:absolute;left:0;text-align:left;margin-left:279.65pt;margin-top:329.1pt;width:184.15pt;height:.05pt;z-index:251668480;visibility:visible;mso-wrap-style:square;mso-wrap-distance-left:9pt;mso-wrap-distance-top:0;mso-wrap-distance-right:9pt;mso-wrap-distance-bottom:0;mso-position-horizontal:absolute;mso-position-horizontal-relative:text;mso-position-vertical:absolute;mso-position-vertical-relative:text;v-text-anchor:top" o:gfxdata="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" stroked="f">
+                  <v:shape w14:anchorId="43578619" id="_x0000_s1029" type="#_x0000_t202" style="position:absolute;left:0;text-align:left;margin-left:279.65pt;margin-top:329.1pt;width:184.15pt;height:.05pt;z-index:251667456;visibility:visible;mso-wrap-style:square;mso-wrap-distance-left:9pt;mso-wrap-distance-top:0;mso-wrap-distance-right:9pt;mso-wrap-distance-bottom:0;mso-position-horizontal:absolute;mso-position-horizontal-relative:text;mso-position-vertical:absolute;mso-position-vertical-relative:text;v-text-anchor:top" o:gfxdata="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" stroked="f">
                     <v:textbox style="mso-fit-shape-to-text:t" inset="0,0,0,0">
                       <w:txbxContent>
                         <w:p>
@@ -959,7 +2659,7 @@
                             <w:rPr>
                               <w:noProof/>
                             </w:rPr>
-                            <w:t>3</w:t>
+                            <w:t>4</w:t>
                           </w:r>
                           <w:r>
                             <w:fldChar w:fldCharType="end"/>
@@ -981,7 +2681,7 @@
               <w:noProof/>
             </w:rPr>
             <w:drawing>
-              <wp:anchor distT="0" distB="0" distL="114300" distR="114300" simplePos="0" relativeHeight="251666432" behindDoc="0" locked="0" layoutInCell="1" allowOverlap="1" wp14:anchorId="47DE7480" wp14:editId="1F7E4F84">
+              <wp:anchor distT="0" distB="0" distL="114300" distR="114300" simplePos="0" relativeHeight="251665408" behindDoc="0" locked="0" layoutInCell="1" allowOverlap="1" wp14:anchorId="47DE7480" wp14:editId="6240239A">
                 <wp:simplePos x="0" y="0"/>
                 <wp:positionH relativeFrom="column">
                   <wp:posOffset>3551786</wp:posOffset>
@@ -1004,7 +2704,7 @@
                         <pic:cNvPicPr/>
                       </pic:nvPicPr>
                       <pic:blipFill>
-                        <a:blip r:embed="rId9" cstate="print">
+                        <a:blip r:embed="rId11" cstate="print">
                           <a:extLst>
                             <a:ext uri="{28A0092B-C50C-407E-A947-70E740481C1C}">
                               <a14:useLocalDpi xmlns:a14="http://schemas.microsoft.com/office/drawing/2010/main" val="0"/>
@@ -1033,20 +2733,75 @@
           <w:r>
             <w:t>Struktura implementace</w:t>
           </w:r>
+          <w:bookmarkEnd w:id="8"/>
         </w:p>
         <w:p>
           <w:r>
-            <w:t>Bližší anglický popis implementací jednotlivých tříd a jejich metod naleznete ve složce implementace/docs, kde se nachází HTML dokumentace vygenerovaná z dokumentačních komentářů v kódu.</w:t>
-          </w:r>
-          <w:r>
-            <w:t xml:space="preserve"> Obrázek adresářové struktury implementace </w:t>
+            <w:t xml:space="preserve">Bližší popis implementací jednotlivých tříd a jejich metod </w:t>
+          </w:r>
+          <w:r>
+            <w:t xml:space="preserve">v anglickém jazyce </w:t>
+          </w:r>
+          <w:r>
+            <w:t>naleznete ve složce implementace/</w:t>
+          </w:r>
+          <w:proofErr w:type="spellStart"/>
+          <w:r>
+            <w:t>docs</w:t>
+          </w:r>
+          <w:proofErr w:type="spellEnd"/>
+          <w:r>
+            <w:t>, kde se nachází HTML dokumentace vygenerovaná z</w:t>
+          </w:r>
+          <w:r>
+            <w:t xml:space="preserve"> </w:t>
+          </w:r>
+          <w:proofErr w:type="spellStart"/>
+          <w:r>
+            <w:t>PHPDoc</w:t>
+          </w:r>
+          <w:proofErr w:type="spellEnd"/>
+          <w:r>
+            <w:t> dokumentačních komentářů v kódu.</w:t>
+          </w:r>
+          <w:r>
+            <w:t xml:space="preserve"> Obrázek</w:t>
+          </w:r>
+          <w:r>
+            <w:t xml:space="preserve"> 4</w:t>
+          </w:r>
+          <w:r>
+            <w:t xml:space="preserve"> </w:t>
+          </w:r>
+          <w:r>
+            <w:t xml:space="preserve">zobrazující </w:t>
+          </w:r>
+          <w:r>
+            <w:t>adresářov</w:t>
+          </w:r>
+          <w:r>
+            <w:t>ou</w:t>
+          </w:r>
+          <w:r>
+            <w:t xml:space="preserve"> struktur</w:t>
+          </w:r>
+          <w:r>
+            <w:t>u</w:t>
+          </w:r>
+          <w:r>
+            <w:t xml:space="preserve"> implementace </w:t>
           </w:r>
           <w:r>
             <w:t>byl</w:t>
           </w:r>
           <w:r>
-            <w:t xml:space="preserve"> získán z IDE PhpStorm</w:t>
-          </w:r>
+            <w:t xml:space="preserve"> získán z IDE </w:t>
+          </w:r>
+          <w:proofErr w:type="spellStart"/>
+          <w:r>
+            <w:t>PhpStorm</w:t>
+          </w:r>
+          <w:proofErr w:type="spellEnd"/>
           <w:r>
             <w:t>.</w:t>
           </w:r>
@@ -1059,18 +2814,99 @@
               <w:numId w:val="1"/>
             </w:numPr>
           </w:pPr>
+          <w:bookmarkStart w:id="9" w:name="_Toc229437728"/>
           <w:r>
             <w:t>Nasazení</w:t>
           </w:r>
+          <w:bookmarkEnd w:id="9"/>
         </w:p>
         <w:p>
           <w:r>
-            <w:t>Aplikace je kontejnerizována pomocí Docker Compose, aby bylo zajištěno konzistentní vývojové a produkční prostředí. Aplikace běží ve dvou kontejnerech db a web, jejich společné konfigurační údaje jako přístupové údaje do databáze se nachází v .env souboru. Kontejner web obsahuje webový Apache server a PHP se všemi potřebnými rozšířeními. Kontejner db běží na obrazu MariaDB a slouží jako perzistentní úložiště dat.</w:t>
+            <w:t xml:space="preserve">Aplikace je kontejnerizována pomocí </w:t>
+          </w:r>
+          <w:proofErr w:type="spellStart"/>
+          <w:r>
+            <w:t>Docker</w:t>
+          </w:r>
+          <w:proofErr w:type="spellEnd"/>
+          <w:r>
+            <w:t xml:space="preserve"> </w:t>
+          </w:r>
+          <w:proofErr w:type="spellStart"/>
+          <w:r>
+            <w:t>Compose</w:t>
+          </w:r>
+          <w:proofErr w:type="spellEnd"/>
+          <w:r>
+            <w:t xml:space="preserve">, aby bylo zajištěno konzistentní vývojové a produkční prostředí. </w:t>
+          </w:r>
+          <w:r>
+            <w:t xml:space="preserve">Systém je distribuován ve formě dvou propojených kontejnerů </w:t>
+          </w:r>
+          <w:proofErr w:type="spellStart"/>
+          <w:r>
+            <w:t>db</w:t>
+          </w:r>
+          <w:proofErr w:type="spellEnd"/>
+          <w:r>
+            <w:t xml:space="preserve"> a web, jejich společné konfigurační údaje jako přístupové údaje do databáze se nachází v</w:t>
+          </w:r>
+          <w:r>
+            <w:t> </w:t>
+          </w:r>
+          <w:proofErr w:type="gramStart"/>
+          <w:r>
+            <w:t>souboru</w:t>
+          </w:r>
+          <w:r>
+            <w:t xml:space="preserve"> </w:t>
+          </w:r>
+          <w:r>
+            <w:t>.</w:t>
+          </w:r>
+          <w:proofErr w:type="spellStart"/>
+          <w:r>
+            <w:t>env</w:t>
+          </w:r>
+          <w:proofErr w:type="spellEnd"/>
+          <w:proofErr w:type="gramEnd"/>
+          <w:r>
+            <w:t xml:space="preserve">. Kontejner web obsahuje webový </w:t>
+          </w:r>
+          <w:proofErr w:type="spellStart"/>
+          <w:r>
+            <w:t>Apache</w:t>
+          </w:r>
+          <w:proofErr w:type="spellEnd"/>
+          <w:r>
+            <w:t xml:space="preserve"> server a PHP se všemi potřebnými rozšířeními. Kontejner </w:t>
+          </w:r>
+          <w:proofErr w:type="spellStart"/>
+          <w:r>
+            <w:t>db</w:t>
+          </w:r>
+          <w:proofErr w:type="spellEnd"/>
+          <w:r>
+            <w:t xml:space="preserve"> běží na obrazu </w:t>
+          </w:r>
+          <w:proofErr w:type="spellStart"/>
+          <w:r>
+            <w:t>MariaDB</w:t>
+          </w:r>
+          <w:proofErr w:type="spellEnd"/>
+          <w:r>
+            <w:t xml:space="preserve"> a slouží jako perzistentní úložiště dat.</w:t>
           </w:r>
         </w:p>
         <w:p>
           <w:r>
-            <w:t xml:space="preserve">Pro snadné sestavení a spuštění kontejnerů byl vytvořen script start.bat pro operační systém MS Windows a start.sh pro </w:t>
+            <w:t>Pro snadné sestavení a spuštění kontejnerů byl vytvořen script start.bat pro operační systém</w:t>
+          </w:r>
+          <w:r>
+            <w:t>y</w:t>
+          </w:r>
+          <w:r>
+            <w:t xml:space="preserve"> MS Windows a start.sh pro </w:t>
           </w:r>
           <w:r>
             <w:t>unixové operační systémy.</w:t>
@@ -1081,10 +2917,11 @@
             <w:rPr>
               <w:noProof/>
             </w:rPr>
+            <w:lastRenderedPageBreak/>
             <mc:AlternateContent>
               <mc:Choice Requires="wps">
                 <w:drawing>
-                  <wp:anchor distT="0" distB="0" distL="114300" distR="114300" simplePos="0" relativeHeight="251671552" behindDoc="0" locked="0" layoutInCell="1" allowOverlap="1" wp14:anchorId="6B4A853E" wp14:editId="1433F95F">
+                  <wp:anchor distT="0" distB="0" distL="114300" distR="114300" simplePos="0" relativeHeight="251670528" behindDoc="0" locked="0" layoutInCell="1" allowOverlap="1" wp14:anchorId="6B4A853E" wp14:editId="0E7A4B8D">
                     <wp:simplePos x="0" y="0"/>
                     <wp:positionH relativeFrom="column">
                       <wp:posOffset>123825</wp:posOffset>
@@ -1141,7 +2978,7 @@
                                   <w:rPr>
                                     <w:noProof/>
                                   </w:rPr>
-                                  <w:t>4</w:t>
+                                  <w:t>5</w:t>
                                 </w:r>
                                 <w:r>
                                   <w:fldChar w:fldCharType="end"/>
@@ -1166,7 +3003,7 @@
               </mc:Choice>
               <mc:Fallback>
                 <w:pict>
-                  <v:shape w14:anchorId="6B4A853E" id="_x0000_s1029" type="#_x0000_t202" style="position:absolute;left:0;text-align:left;margin-left:9.75pt;margin-top:187.8pt;width:445.5pt;height:.05pt;z-index:251671552;visibility:visible;mso-wrap-style:square;mso-wrap-distance-left:9pt;mso-wrap-distance-top:0;mso-wrap-distance-right:9pt;mso-wrap-distance-bottom:0;mso-position-horizontal:absolute;mso-position-horizontal-relative:text;mso-position-vertical:absolute;mso-position-vertical-relative:text;v-text-anchor:top" o:gfxdata="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" stroked="f">
+                  <v:shape w14:anchorId="6B4A853E" id="_x0000_s1030" type="#_x0000_t202" style="position:absolute;left:0;text-align:left;margin-left:9.75pt;margin-top:187.8pt;width:445.5pt;height:.05pt;z-index:251670528;visibility:visible;mso-wrap-style:square;mso-wrap-distance-left:9pt;mso-wrap-distance-top:0;mso-wrap-distance-right:9pt;mso-wrap-distance-bottom:0;mso-position-horizontal:absolute;mso-position-horizontal-relative:text;mso-position-vertical:absolute;mso-position-vertical-relative:text;v-text-anchor:top" o:gfxdata="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" stroked="f">
                     <v:textbox style="mso-fit-shape-to-text:t" inset="0,0,0,0">
                       <w:txbxContent>
                         <w:p>
@@ -1192,7 +3029,7 @@
                             <w:rPr>
                               <w:noProof/>
                             </w:rPr>
-                            <w:t>4</w:t>
+                            <w:t>5</w:t>
                           </w:r>
                           <w:r>
                             <w:fldChar w:fldCharType="end"/>
@@ -1214,7 +3051,7 @@
               <w:noProof/>
             </w:rPr>
             <w:drawing>
-              <wp:anchor distT="0" distB="0" distL="114300" distR="114300" simplePos="0" relativeHeight="251669504" behindDoc="0" locked="0" layoutInCell="1" allowOverlap="1" wp14:anchorId="35762889" wp14:editId="715FCD26">
+              <wp:anchor distT="0" distB="0" distL="114300" distR="114300" simplePos="0" relativeHeight="251668480" behindDoc="0" locked="0" layoutInCell="1" allowOverlap="1" wp14:anchorId="35762889" wp14:editId="6767A6E3">
                 <wp:simplePos x="0" y="0"/>
                 <wp:positionH relativeFrom="column">
                   <wp:posOffset>123825</wp:posOffset>
@@ -1237,7 +3074,7 @@
                         <pic:cNvPicPr/>
                       </pic:nvPicPr>
                       <pic:blipFill>
-                        <a:blip r:embed="rId10">
+                        <a:blip r:embed="rId12">
                           <a:extLst>
                             <a:ext uri="{28A0092B-C50C-407E-A947-70E740481C1C}">
                               <a14:useLocalDpi xmlns:a14="http://schemas.microsoft.com/office/drawing/2010/main" val="0"/>
@@ -1264,9 +3101,1212 @@
             </w:drawing>
           </w:r>
         </w:p>
+        <w:p/>
         <w:p>
-          <w:r>
-            <w:br/>
+          <w:pPr>
+            <w:ind w:firstLine="0"/>
+          </w:pPr>
+          <w:r>
+            <w:br w:type="page"/>
+          </w:r>
+        </w:p>
+        <w:p>
+          <w:pPr>
+            <w:pStyle w:val="Heading1"/>
+            <w:numPr>
+              <w:ilvl w:val="0"/>
+              <w:numId w:val="1"/>
+            </w:numPr>
+          </w:pPr>
+          <w:bookmarkStart w:id="10" w:name="_Toc229437729"/>
+          <w:r>
+            <w:lastRenderedPageBreak/>
+            <w:t>Finální podoba aplikace</w:t>
+          </w:r>
+          <w:bookmarkEnd w:id="10"/>
+        </w:p>
+        <w:p>
+          <w:r>
+            <w:t xml:space="preserve">Po spuštění </w:t>
+          </w:r>
+          <w:proofErr w:type="spellStart"/>
+          <w:r>
+            <w:t>Docker</w:t>
+          </w:r>
+          <w:proofErr w:type="spellEnd"/>
+          <w:r>
+            <w:t xml:space="preserve"> </w:t>
+          </w:r>
+          <w:proofErr w:type="spellStart"/>
+          <w:r>
+            <w:t>containerů</w:t>
+          </w:r>
+          <w:proofErr w:type="spellEnd"/>
+          <w:r>
+            <w:t xml:space="preserve"> je aplikace dostupná na</w:t>
+          </w:r>
+          <w:r>
+            <w:t xml:space="preserve"> adrese</w:t>
+          </w:r>
+          <w:r>
+            <w:t xml:space="preserve"> </w:t>
+          </w:r>
+          <w:hyperlink r:id="rId13" w:history="1">
+            <w:r>
+              <w:rPr>
+                <w:rStyle w:val="Hyperlink"/>
+              </w:rPr>
+              <w:t>http://localhost:8888</w:t>
+            </w:r>
+          </w:hyperlink>
+          <w:r>
+            <w:t xml:space="preserve">. </w:t>
+          </w:r>
+          <w:r>
+            <w:t xml:space="preserve">Při </w:t>
+          </w:r>
+          <w:r>
+            <w:t>přístupu na tuto adresu</w:t>
+          </w:r>
+          <w:r>
+            <w:t xml:space="preserve"> se zobrazí stránka se seznamem všech pacientů, ze které je možné přistupovat do dalších částí aplikace.</w:t>
+          </w:r>
+        </w:p>
+        <w:p>
+          <w:pPr>
+            <w:pStyle w:val="Heading2"/>
+          </w:pPr>
+          <w:bookmarkStart w:id="11" w:name="_Toc229437730"/>
+          <w:r>
+            <w:t>4.1. Uživatelské rozhraní</w:t>
+          </w:r>
+          <w:bookmarkEnd w:id="11"/>
+        </w:p>
+        <w:p>
+          <w:r>
+            <w:rPr>
+              <w:noProof/>
+            </w:rPr>
+            <mc:AlternateContent>
+              <mc:Choice Requires="wps">
+                <w:drawing>
+                  <wp:anchor distT="0" distB="0" distL="114300" distR="114300" simplePos="0" relativeHeight="251676672" behindDoc="0" locked="0" layoutInCell="1" allowOverlap="1" wp14:anchorId="6B700468" wp14:editId="589A5396">
+                    <wp:simplePos x="0" y="0"/>
+                    <wp:positionH relativeFrom="margin">
+                      <wp:align>center</wp:align>
+                    </wp:positionH>
+                    <wp:positionV relativeFrom="paragraph">
+                      <wp:posOffset>4465320</wp:posOffset>
+                    </wp:positionV>
+                    <wp:extent cx="5143500" cy="635"/>
+                    <wp:effectExtent l="0" t="0" r="0" b="8255"/>
+                    <wp:wrapTopAndBottom/>
+                    <wp:docPr id="1033208648" name="Text Box 1"/>
+                    <wp:cNvGraphicFramePr/>
+                    <a:graphic xmlns:a="http://schemas.openxmlformats.org/drawingml/2006/main">
+                      <a:graphicData uri="http://schemas.microsoft.com/office/word/2010/wordprocessingShape">
+                        <wps:wsp>
+                          <wps:cNvSpPr txBox="1"/>
+                          <wps:spPr>
+                            <a:xfrm>
+                              <a:off x="0" y="0"/>
+                              <a:ext cx="5143500" cy="635"/>
+                            </a:xfrm>
+                            <a:prstGeom prst="rect">
+                              <a:avLst/>
+                            </a:prstGeom>
+                            <a:solidFill>
+                              <a:prstClr val="white"/>
+                            </a:solidFill>
+                            <a:ln>
+                              <a:noFill/>
+                            </a:ln>
+                          </wps:spPr>
+                          <wps:txbx>
+                            <w:txbxContent>
+                              <w:p>
+                                <w:pPr>
+                                  <w:pStyle w:val="Caption"/>
+                                  <w:rPr>
+                                    <w:noProof/>
+                                  </w:rPr>
+                                </w:pPr>
+                                <w:r>
+                                  <w:t xml:space="preserve">Obrázek </w:t>
+                                </w:r>
+                                <w:r>
+                                  <w:fldChar w:fldCharType="begin"/>
+                                </w:r>
+                                <w:r>
+                                  <w:instrText xml:space="preserve"> SEQ Obrázek \* ARABIC </w:instrText>
+                                </w:r>
+                                <w:r>
+                                  <w:fldChar w:fldCharType="separate"/>
+                                </w:r>
+                                <w:r>
+                                  <w:rPr>
+                                    <w:noProof/>
+                                  </w:rPr>
+                                  <w:t>6</w:t>
+                                </w:r>
+                                <w:r>
+                                  <w:fldChar w:fldCharType="end"/>
+                                </w:r>
+                                <w:r>
+                                  <w:t>: Snímek stránky se seznamem pacientů</w:t>
+                                </w:r>
+                              </w:p>
+                            </w:txbxContent>
+                          </wps:txbx>
+                          <wps:bodyPr rot="0" spcFirstLastPara="0" vertOverflow="overflow" horzOverflow="overflow" vert="horz" wrap="square" lIns="0" tIns="0" rIns="0" bIns="0" numCol="1" spcCol="0" rtlCol="0" fromWordArt="0" anchor="t" anchorCtr="0" forceAA="0" compatLnSpc="1">
+                            <a:prstTxWarp prst="textNoShape">
+                              <a:avLst/>
+                            </a:prstTxWarp>
+                            <a:spAutoFit/>
+                          </wps:bodyPr>
+                        </wps:wsp>
+                      </a:graphicData>
+                    </a:graphic>
+                  </wp:anchor>
+                </w:drawing>
+              </mc:Choice>
+              <mc:Fallback>
+                <w:pict>
+                  <v:shape w14:anchorId="6B700468" id="_x0000_s1031" type="#_x0000_t202" style="position:absolute;left:0;text-align:left;margin-left:0;margin-top:351.6pt;width:405pt;height:.05pt;z-index:251676672;visibility:visible;mso-wrap-style:square;mso-wrap-distance-left:9pt;mso-wrap-distance-top:0;mso-wrap-distance-right:9pt;mso-wrap-distance-bottom:0;mso-position-horizontal:center;mso-position-horizontal-relative:margin;mso-position-vertical:absolute;mso-position-vertical-relative:text;v-text-anchor:top" o:gfxdata="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" stroked="f">
+                    <v:textbox style="mso-fit-shape-to-text:t" inset="0,0,0,0">
+                      <w:txbxContent>
+                        <w:p>
+                          <w:pPr>
+                            <w:pStyle w:val="Caption"/>
+                            <w:rPr>
+                              <w:noProof/>
+                            </w:rPr>
+                          </w:pPr>
+                          <w:r>
+                            <w:t xml:space="preserve">Obrázek </w:t>
+                          </w:r>
+                          <w:r>
+                            <w:fldChar w:fldCharType="begin"/>
+                          </w:r>
+                          <w:r>
+                            <w:instrText xml:space="preserve"> SEQ Obrázek \* ARABIC </w:instrText>
+                          </w:r>
+                          <w:r>
+                            <w:fldChar w:fldCharType="separate"/>
+                          </w:r>
+                          <w:r>
+                            <w:rPr>
+                              <w:noProof/>
+                            </w:rPr>
+                            <w:t>6</w:t>
+                          </w:r>
+                          <w:r>
+                            <w:fldChar w:fldCharType="end"/>
+                          </w:r>
+                          <w:r>
+                            <w:t>: Snímek stránky se seznamem pacientů</w:t>
+                          </w:r>
+                        </w:p>
+                      </w:txbxContent>
+                    </v:textbox>
+                    <w10:wrap type="topAndBottom" anchorx="margin"/>
+                  </v:shape>
+                </w:pict>
+              </mc:Fallback>
+            </mc:AlternateContent>
+          </w:r>
+          <w:r>
+            <w:rPr>
+              <w:noProof/>
+            </w:rPr>
+            <w:drawing>
+              <wp:anchor distT="0" distB="0" distL="114300" distR="114300" simplePos="0" relativeHeight="251674624" behindDoc="0" locked="0" layoutInCell="1" allowOverlap="1" wp14:anchorId="27736490" wp14:editId="7F39F317">
+                <wp:simplePos x="0" y="0"/>
+                <wp:positionH relativeFrom="margin">
+                  <wp:align>center</wp:align>
+                </wp:positionH>
+                <wp:positionV relativeFrom="paragraph">
+                  <wp:posOffset>1799590</wp:posOffset>
+                </wp:positionV>
+                <wp:extent cx="5143500" cy="2527300"/>
+                <wp:effectExtent l="0" t="0" r="0" b="6350"/>
+                <wp:wrapTopAndBottom/>
+                <wp:docPr id="1211005135" name="Picture 6"/>
+                <wp:cNvGraphicFramePr>
+                  <a:graphicFrameLocks xmlns:a="http://schemas.openxmlformats.org/drawingml/2006/main" noChangeAspect="1"/>
+                </wp:cNvGraphicFramePr>
+                <a:graphic xmlns:a="http://schemas.openxmlformats.org/drawingml/2006/main">
+                  <a:graphicData uri="http://schemas.openxmlformats.org/drawingml/2006/picture">
+                    <pic:pic xmlns:pic="http://schemas.openxmlformats.org/drawingml/2006/picture">
+                      <pic:nvPicPr>
+                        <pic:cNvPr id="1211005135" name="Picture 1211005135"/>
+                        <pic:cNvPicPr/>
+                      </pic:nvPicPr>
+                      <pic:blipFill rotWithShape="1">
+                        <a:blip r:embed="rId14" cstate="print">
+                          <a:extLst>
+                            <a:ext uri="{28A0092B-C50C-407E-A947-70E740481C1C}">
+                              <a14:useLocalDpi xmlns:a14="http://schemas.microsoft.com/office/drawing/2010/main" val="0"/>
+                            </a:ext>
+                          </a:extLst>
+                        </a:blip>
+                        <a:srcRect t="671"/>
+                        <a:stretch>
+                          <a:fillRect/>
+                        </a:stretch>
+                      </pic:blipFill>
+                      <pic:spPr bwMode="auto">
+                        <a:xfrm>
+                          <a:off x="0" y="0"/>
+                          <a:ext cx="5143500" cy="2527300"/>
+                        </a:xfrm>
+                        <a:prstGeom prst="rect">
+                          <a:avLst/>
+                        </a:prstGeom>
+                        <a:ln>
+                          <a:noFill/>
+                        </a:ln>
+                        <a:extLst>
+                          <a:ext uri="{53640926-AAD7-44D8-BBD7-CCE9431645EC}">
+                            <a14:shadowObscured xmlns:a14="http://schemas.microsoft.com/office/drawing/2010/main"/>
+                          </a:ext>
+                        </a:extLst>
+                      </pic:spPr>
+                    </pic:pic>
+                  </a:graphicData>
+                </a:graphic>
+                <wp14:sizeRelH relativeFrom="margin">
+                  <wp14:pctWidth>0</wp14:pctWidth>
+                </wp14:sizeRelH>
+                <wp14:sizeRelV relativeFrom="margin">
+                  <wp14:pctHeight>0</wp14:pctHeight>
+                </wp14:sizeRelV>
+              </wp:anchor>
+            </w:drawing>
+          </w:r>
+          <w:r>
+            <w:t>Pro responzivitu a přehlednost uživatelského rozhraní byla použita knihovna kaskádových stylů</w:t>
+          </w:r>
+          <w:r>
+            <w:t xml:space="preserve"> a ikon</w:t>
+          </w:r>
+          <w:r>
+            <w:t xml:space="preserve"> </w:t>
+          </w:r>
+          <w:proofErr w:type="spellStart"/>
+          <w:r>
+            <w:t>Bootstrap</w:t>
+          </w:r>
+          <w:proofErr w:type="spellEnd"/>
+          <w:r>
+            <w:t xml:space="preserve">, respektive </w:t>
+          </w:r>
+          <w:proofErr w:type="spellStart"/>
+          <w:r>
+            <w:t>Bootstrap</w:t>
+          </w:r>
+          <w:proofErr w:type="spellEnd"/>
+          <w:r>
+            <w:t xml:space="preserve"> </w:t>
+          </w:r>
+          <w:proofErr w:type="spellStart"/>
+          <w:r>
+            <w:t>Icons</w:t>
+          </w:r>
+          <w:proofErr w:type="spellEnd"/>
+          <w:r>
+            <w:t xml:space="preserve">, rozložení se jen mírně změnilo oproti původnímu návrh, například přítomností navigačního panelu </w:t>
+          </w:r>
+          <w:r>
+            <w:t>na všech stránkách aplikace, která umožňuje rychlý přesun z jedné části aplikace do jiné namísto původně zamýšlené přítomnosti pouze tlačítek zpět</w:t>
+          </w:r>
+          <w:r>
+            <w:t>.</w:t>
+          </w:r>
+          <w:r>
+            <w:t xml:space="preserve"> </w:t>
+          </w:r>
+          <w:r>
+            <w:t>Pro neimplementované hlavní stránky byly připraveny odkazy v navigačním panelu na stránky prozatím bez obsahu.</w:t>
+          </w:r>
+          <w:r>
+            <w:t xml:space="preserve"> Byla použita paleta základních barev pro odlišení různých pacientových záznamů</w:t>
+          </w:r>
+          <w:r>
+            <w:t>, jinak sdílí všechny formuláře jednotný design</w:t>
+          </w:r>
+          <w:r>
+            <w:t xml:space="preserve">. </w:t>
+          </w:r>
+        </w:p>
+        <w:p>
+          <w:r>
+            <w:rPr>
+              <w:noProof/>
+            </w:rPr>
+            <w:lastRenderedPageBreak/>
+            <mc:AlternateContent>
+              <mc:Choice Requires="wps">
+                <w:drawing>
+                  <wp:anchor distT="0" distB="0" distL="114300" distR="114300" simplePos="0" relativeHeight="251682816" behindDoc="0" locked="0" layoutInCell="1" allowOverlap="1" wp14:anchorId="36681C12" wp14:editId="41E1FA23">
+                    <wp:simplePos x="0" y="0"/>
+                    <wp:positionH relativeFrom="margin">
+                      <wp:align>center</wp:align>
+                    </wp:positionH>
+                    <wp:positionV relativeFrom="paragraph">
+                      <wp:posOffset>6042025</wp:posOffset>
+                    </wp:positionV>
+                    <wp:extent cx="5042535" cy="635"/>
+                    <wp:effectExtent l="0" t="0" r="5715" b="8255"/>
+                    <wp:wrapTopAndBottom/>
+                    <wp:docPr id="725202748" name="Text Box 1"/>
+                    <wp:cNvGraphicFramePr/>
+                    <a:graphic xmlns:a="http://schemas.openxmlformats.org/drawingml/2006/main">
+                      <a:graphicData uri="http://schemas.microsoft.com/office/word/2010/wordprocessingShape">
+                        <wps:wsp>
+                          <wps:cNvSpPr txBox="1"/>
+                          <wps:spPr>
+                            <a:xfrm>
+                              <a:off x="0" y="0"/>
+                              <a:ext cx="5042535" cy="635"/>
+                            </a:xfrm>
+                            <a:prstGeom prst="rect">
+                              <a:avLst/>
+                            </a:prstGeom>
+                            <a:solidFill>
+                              <a:prstClr val="white"/>
+                            </a:solidFill>
+                            <a:ln>
+                              <a:noFill/>
+                            </a:ln>
+                          </wps:spPr>
+                          <wps:txbx>
+                            <w:txbxContent>
+                              <w:p>
+                                <w:pPr>
+                                  <w:pStyle w:val="Caption"/>
+                                  <w:rPr>
+                                    <w:noProof/>
+                                  </w:rPr>
+                                </w:pPr>
+                                <w:r>
+                                  <w:t xml:space="preserve">Obrázek </w:t>
+                                </w:r>
+                                <w:r>
+                                  <w:fldChar w:fldCharType="begin"/>
+                                </w:r>
+                                <w:r>
+                                  <w:instrText xml:space="preserve"> SEQ Obrázek \* ARABIC </w:instrText>
+                                </w:r>
+                                <w:r>
+                                  <w:fldChar w:fldCharType="separate"/>
+                                </w:r>
+                                <w:r>
+                                  <w:rPr>
+                                    <w:noProof/>
+                                  </w:rPr>
+                                  <w:t>7</w:t>
+                                </w:r>
+                                <w:r>
+                                  <w:fldChar w:fldCharType="end"/>
+                                </w:r>
+                                <w:r>
+                                  <w:t>: Snímek formuláře pro předpis léčiva</w:t>
+                                </w:r>
+                              </w:p>
+                            </w:txbxContent>
+                          </wps:txbx>
+                          <wps:bodyPr rot="0" spcFirstLastPara="0" vertOverflow="overflow" horzOverflow="overflow" vert="horz" wrap="square" lIns="0" tIns="0" rIns="0" bIns="0" numCol="1" spcCol="0" rtlCol="0" fromWordArt="0" anchor="t" anchorCtr="0" forceAA="0" compatLnSpc="1">
+                            <a:prstTxWarp prst="textNoShape">
+                              <a:avLst/>
+                            </a:prstTxWarp>
+                            <a:spAutoFit/>
+                          </wps:bodyPr>
+                        </wps:wsp>
+                      </a:graphicData>
+                    </a:graphic>
+                  </wp:anchor>
+                </w:drawing>
+              </mc:Choice>
+              <mc:Fallback>
+                <w:pict>
+                  <v:shape w14:anchorId="36681C12" id="_x0000_s1032" type="#_x0000_t202" style="position:absolute;left:0;text-align:left;margin-left:0;margin-top:475.75pt;width:397.05pt;height:.05pt;z-index:251682816;visibility:visible;mso-wrap-style:square;mso-wrap-distance-left:9pt;mso-wrap-distance-top:0;mso-wrap-distance-right:9pt;mso-wrap-distance-bottom:0;mso-position-horizontal:center;mso-position-horizontal-relative:margin;mso-position-vertical:absolute;mso-position-vertical-relative:text;v-text-anchor:top" o:gfxdata="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" stroked="f">
+                    <v:textbox style="mso-fit-shape-to-text:t" inset="0,0,0,0">
+                      <w:txbxContent>
+                        <w:p>
+                          <w:pPr>
+                            <w:pStyle w:val="Caption"/>
+                            <w:rPr>
+                              <w:noProof/>
+                            </w:rPr>
+                          </w:pPr>
+                          <w:r>
+                            <w:t xml:space="preserve">Obrázek </w:t>
+                          </w:r>
+                          <w:r>
+                            <w:fldChar w:fldCharType="begin"/>
+                          </w:r>
+                          <w:r>
+                            <w:instrText xml:space="preserve"> SEQ Obrázek \* ARABIC </w:instrText>
+                          </w:r>
+                          <w:r>
+                            <w:fldChar w:fldCharType="separate"/>
+                          </w:r>
+                          <w:r>
+                            <w:rPr>
+                              <w:noProof/>
+                            </w:rPr>
+                            <w:t>7</w:t>
+                          </w:r>
+                          <w:r>
+                            <w:fldChar w:fldCharType="end"/>
+                          </w:r>
+                          <w:r>
+                            <w:t>: Snímek formuláře pro předpis léčiva</w:t>
+                          </w:r>
+                        </w:p>
+                      </w:txbxContent>
+                    </v:textbox>
+                    <w10:wrap type="topAndBottom" anchorx="margin"/>
+                  </v:shape>
+                </w:pict>
+              </mc:Fallback>
+            </mc:AlternateContent>
+          </w:r>
+          <w:r>
+            <w:rPr>
+              <w:noProof/>
+            </w:rPr>
+            <w:drawing>
+              <wp:anchor distT="0" distB="0" distL="114300" distR="114300" simplePos="0" relativeHeight="251680768" behindDoc="0" locked="0" layoutInCell="1" allowOverlap="1" wp14:anchorId="146B1175" wp14:editId="53A28311">
+                <wp:simplePos x="0" y="0"/>
+                <wp:positionH relativeFrom="margin">
+                  <wp:align>center</wp:align>
+                </wp:positionH>
+                <wp:positionV relativeFrom="paragraph">
+                  <wp:posOffset>4332923</wp:posOffset>
+                </wp:positionV>
+                <wp:extent cx="5042535" cy="1642745"/>
+                <wp:effectExtent l="0" t="0" r="5715" b="0"/>
+                <wp:wrapTopAndBottom/>
+                <wp:docPr id="36791297" name="Picture 10"/>
+                <wp:cNvGraphicFramePr>
+                  <a:graphicFrameLocks xmlns:a="http://schemas.openxmlformats.org/drawingml/2006/main" noChangeAspect="1"/>
+                </wp:cNvGraphicFramePr>
+                <a:graphic xmlns:a="http://schemas.openxmlformats.org/drawingml/2006/main">
+                  <a:graphicData uri="http://schemas.openxmlformats.org/drawingml/2006/picture">
+                    <pic:pic xmlns:pic="http://schemas.openxmlformats.org/drawingml/2006/picture">
+                      <pic:nvPicPr>
+                        <pic:cNvPr id="36791297" name="Picture 36791297"/>
+                        <pic:cNvPicPr/>
+                      </pic:nvPicPr>
+                      <pic:blipFill rotWithShape="1">
+                        <a:blip r:embed="rId15" cstate="print">
+                          <a:extLst>
+                            <a:ext uri="{28A0092B-C50C-407E-A947-70E740481C1C}">
+                              <a14:useLocalDpi xmlns:a14="http://schemas.microsoft.com/office/drawing/2010/main" val="0"/>
+                            </a:ext>
+                          </a:extLst>
+                        </a:blip>
+                        <a:srcRect t="543" b="5775"/>
+                        <a:stretch>
+                          <a:fillRect/>
+                        </a:stretch>
+                      </pic:blipFill>
+                      <pic:spPr bwMode="auto">
+                        <a:xfrm>
+                          <a:off x="0" y="0"/>
+                          <a:ext cx="5042535" cy="1642745"/>
+                        </a:xfrm>
+                        <a:prstGeom prst="rect">
+                          <a:avLst/>
+                        </a:prstGeom>
+                        <a:ln>
+                          <a:noFill/>
+                        </a:ln>
+                        <a:extLst>
+                          <a:ext uri="{53640926-AAD7-44D8-BBD7-CCE9431645EC}">
+                            <a14:shadowObscured xmlns:a14="http://schemas.microsoft.com/office/drawing/2010/main"/>
+                          </a:ext>
+                        </a:extLst>
+                      </pic:spPr>
+                    </pic:pic>
+                  </a:graphicData>
+                </a:graphic>
+                <wp14:sizeRelV relativeFrom="margin">
+                  <wp14:pctHeight>0</wp14:pctHeight>
+                </wp14:sizeRelV>
+              </wp:anchor>
+            </w:drawing>
+          </w:r>
+          <w:r>
+            <w:rPr>
+              <w:noProof/>
+            </w:rPr>
+            <mc:AlternateContent>
+              <mc:Choice Requires="wps">
+                <w:drawing>
+                  <wp:anchor distT="0" distB="0" distL="114300" distR="114300" simplePos="0" relativeHeight="251679744" behindDoc="0" locked="0" layoutInCell="1" allowOverlap="1" wp14:anchorId="5847258C" wp14:editId="2A21F910">
+                    <wp:simplePos x="0" y="0"/>
+                    <wp:positionH relativeFrom="margin">
+                      <wp:align>center</wp:align>
+                    </wp:positionH>
+                    <wp:positionV relativeFrom="paragraph">
+                      <wp:posOffset>3950970</wp:posOffset>
+                    </wp:positionV>
+                    <wp:extent cx="5067300" cy="635"/>
+                    <wp:effectExtent l="0" t="0" r="0" b="8255"/>
+                    <wp:wrapTopAndBottom/>
+                    <wp:docPr id="1354702846" name="Text Box 1"/>
+                    <wp:cNvGraphicFramePr/>
+                    <a:graphic xmlns:a="http://schemas.openxmlformats.org/drawingml/2006/main">
+                      <a:graphicData uri="http://schemas.microsoft.com/office/word/2010/wordprocessingShape">
+                        <wps:wsp>
+                          <wps:cNvSpPr txBox="1"/>
+                          <wps:spPr>
+                            <a:xfrm>
+                              <a:off x="0" y="0"/>
+                              <a:ext cx="5067300" cy="635"/>
+                            </a:xfrm>
+                            <a:prstGeom prst="rect">
+                              <a:avLst/>
+                            </a:prstGeom>
+                            <a:solidFill>
+                              <a:prstClr val="white"/>
+                            </a:solidFill>
+                            <a:ln>
+                              <a:noFill/>
+                            </a:ln>
+                          </wps:spPr>
+                          <wps:txbx>
+                            <w:txbxContent>
+                              <w:p>
+                                <w:pPr>
+                                  <w:pStyle w:val="Caption"/>
+                                  <w:rPr>
+                                    <w:noProof/>
+                                  </w:rPr>
+                                </w:pPr>
+                                <w:r>
+                                  <w:t xml:space="preserve">Obrázek </w:t>
+                                </w:r>
+                                <w:r>
+                                  <w:fldChar w:fldCharType="begin"/>
+                                </w:r>
+                                <w:r>
+                                  <w:instrText xml:space="preserve"> SEQ Obrázek \* ARABIC </w:instrText>
+                                </w:r>
+                                <w:r>
+                                  <w:fldChar w:fldCharType="separate"/>
+                                </w:r>
+                                <w:r>
+                                  <w:rPr>
+                                    <w:noProof/>
+                                  </w:rPr>
+                                  <w:t>8</w:t>
+                                </w:r>
+                                <w:r>
+                                  <w:fldChar w:fldCharType="end"/>
+                                </w:r>
+                                <w:r>
+                                  <w:t>: Snímek detailu pacienta</w:t>
+                                </w:r>
+                              </w:p>
+                            </w:txbxContent>
+                          </wps:txbx>
+                          <wps:bodyPr rot="0" spcFirstLastPara="0" vertOverflow="overflow" horzOverflow="overflow" vert="horz" wrap="square" lIns="0" tIns="0" rIns="0" bIns="0" numCol="1" spcCol="0" rtlCol="0" fromWordArt="0" anchor="t" anchorCtr="0" forceAA="0" compatLnSpc="1">
+                            <a:prstTxWarp prst="textNoShape">
+                              <a:avLst/>
+                            </a:prstTxWarp>
+                            <a:spAutoFit/>
+                          </wps:bodyPr>
+                        </wps:wsp>
+                      </a:graphicData>
+                    </a:graphic>
+                  </wp:anchor>
+                </w:drawing>
+              </mc:Choice>
+              <mc:Fallback>
+                <w:pict>
+                  <v:shape w14:anchorId="5847258C" id="_x0000_s1033" type="#_x0000_t202" style="position:absolute;left:0;text-align:left;margin-left:0;margin-top:311.1pt;width:399pt;height:.05pt;z-index:251679744;visibility:visible;mso-wrap-style:square;mso-wrap-distance-left:9pt;mso-wrap-distance-top:0;mso-wrap-distance-right:9pt;mso-wrap-distance-bottom:0;mso-position-horizontal:center;mso-position-horizontal-relative:margin;mso-position-vertical:absolute;mso-position-vertical-relative:text;v-text-anchor:top" o:gfxdata="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" stroked="f">
+                    <v:textbox style="mso-fit-shape-to-text:t" inset="0,0,0,0">
+                      <w:txbxContent>
+                        <w:p>
+                          <w:pPr>
+                            <w:pStyle w:val="Caption"/>
+                            <w:rPr>
+                              <w:noProof/>
+                            </w:rPr>
+                          </w:pPr>
+                          <w:r>
+                            <w:t xml:space="preserve">Obrázek </w:t>
+                          </w:r>
+                          <w:r>
+                            <w:fldChar w:fldCharType="begin"/>
+                          </w:r>
+                          <w:r>
+                            <w:instrText xml:space="preserve"> SEQ Obrázek \* ARABIC </w:instrText>
+                          </w:r>
+                          <w:r>
+                            <w:fldChar w:fldCharType="separate"/>
+                          </w:r>
+                          <w:r>
+                            <w:rPr>
+                              <w:noProof/>
+                            </w:rPr>
+                            <w:t>8</w:t>
+                          </w:r>
+                          <w:r>
+                            <w:fldChar w:fldCharType="end"/>
+                          </w:r>
+                          <w:r>
+                            <w:t>: Snímek detailu pacienta</w:t>
+                          </w:r>
+                        </w:p>
+                      </w:txbxContent>
+                    </v:textbox>
+                    <w10:wrap type="topAndBottom" anchorx="margin"/>
+                  </v:shape>
+                </w:pict>
+              </mc:Fallback>
+            </mc:AlternateContent>
+          </w:r>
+          <w:r>
+            <w:rPr>
+              <w:noProof/>
+            </w:rPr>
+            <mc:AlternateContent>
+              <mc:Choice Requires="wpg">
+                <w:drawing>
+                  <wp:anchor distT="0" distB="0" distL="114300" distR="114300" simplePos="0" relativeHeight="251678720" behindDoc="0" locked="0" layoutInCell="1" allowOverlap="1" wp14:anchorId="70808E62" wp14:editId="0BF6E9F8">
+                    <wp:simplePos x="0" y="0"/>
+                    <wp:positionH relativeFrom="margin">
+                      <wp:align>center</wp:align>
+                    </wp:positionH>
+                    <wp:positionV relativeFrom="paragraph">
+                      <wp:posOffset>201295</wp:posOffset>
+                    </wp:positionV>
+                    <wp:extent cx="5067300" cy="3655378"/>
+                    <wp:effectExtent l="0" t="0" r="0" b="2540"/>
+                    <wp:wrapTopAndBottom/>
+                    <wp:docPr id="783695773" name="Group 9"/>
+                    <wp:cNvGraphicFramePr/>
+                    <a:graphic xmlns:a="http://schemas.openxmlformats.org/drawingml/2006/main">
+                      <a:graphicData uri="http://schemas.microsoft.com/office/word/2010/wordprocessingGroup">
+                        <wpg:wgp>
+                          <wpg:cNvGrpSpPr/>
+                          <wpg:grpSpPr>
+                            <a:xfrm>
+                              <a:off x="0" y="0"/>
+                              <a:ext cx="5067300" cy="3655378"/>
+                              <a:chOff x="0" y="0"/>
+                              <a:chExt cx="5067300" cy="3655378"/>
+                            </a:xfrm>
+                          </wpg:grpSpPr>
+                          <pic:pic xmlns:pic="http://schemas.openxmlformats.org/drawingml/2006/picture">
+                            <pic:nvPicPr>
+                              <pic:cNvPr id="1697870845" name="Picture 7"/>
+                              <pic:cNvPicPr>
+                                <a:picLocks noChangeAspect="1"/>
+                              </pic:cNvPicPr>
+                            </pic:nvPicPr>
+                            <pic:blipFill rotWithShape="1">
+                              <a:blip r:embed="rId16" cstate="print">
+                                <a:extLst>
+                                  <a:ext uri="{28A0092B-C50C-407E-A947-70E740481C1C}">
+                                    <a14:useLocalDpi xmlns:a14="http://schemas.microsoft.com/office/drawing/2010/main" val="0"/>
+                                  </a:ext>
+                                </a:extLst>
+                              </a:blip>
+                              <a:srcRect t="955"/>
+                              <a:stretch>
+                                <a:fillRect/>
+                              </a:stretch>
+                            </pic:blipFill>
+                            <pic:spPr bwMode="auto">
+                              <a:xfrm>
+                                <a:off x="0" y="0"/>
+                                <a:ext cx="5067300" cy="2470150"/>
+                              </a:xfrm>
+                              <a:prstGeom prst="rect">
+                                <a:avLst/>
+                              </a:prstGeom>
+                              <a:ln>
+                                <a:noFill/>
+                              </a:ln>
+                              <a:extLst>
+                                <a:ext uri="{53640926-AAD7-44D8-BBD7-CCE9431645EC}">
+                                  <a14:shadowObscured xmlns:a14="http://schemas.microsoft.com/office/drawing/2010/main"/>
+                                </a:ext>
+                              </a:extLst>
+                            </pic:spPr>
+                          </pic:pic>
+                          <pic:pic xmlns:pic="http://schemas.openxmlformats.org/drawingml/2006/picture">
+                            <pic:nvPicPr>
+                              <pic:cNvPr id="1477166256" name="Picture 8"/>
+                              <pic:cNvPicPr>
+                                <a:picLocks noChangeAspect="1"/>
+                              </pic:cNvPicPr>
+                            </pic:nvPicPr>
+                            <pic:blipFill>
+                              <a:blip r:embed="rId17">
+                                <a:extLst>
+                                  <a:ext uri="{28A0092B-C50C-407E-A947-70E740481C1C}">
+                                    <a14:useLocalDpi xmlns:a14="http://schemas.microsoft.com/office/drawing/2010/main" val="0"/>
+                                  </a:ext>
+                                </a:extLst>
+                              </a:blip>
+                              <a:stretch>
+                                <a:fillRect/>
+                              </a:stretch>
+                            </pic:blipFill>
+                            <pic:spPr>
+                              <a:xfrm>
+                                <a:off x="0" y="2319338"/>
+                                <a:ext cx="5066665" cy="1336040"/>
+                              </a:xfrm>
+                              <a:prstGeom prst="rect">
+                                <a:avLst/>
+                              </a:prstGeom>
+                            </pic:spPr>
+                          </pic:pic>
+                        </wpg:wgp>
+                      </a:graphicData>
+                    </a:graphic>
+                  </wp:anchor>
+                </w:drawing>
+              </mc:Choice>
+              <mc:Fallback>
+                <w:pict>
+                  <v:group w14:anchorId="06A1869C" id="Group 9" o:spid="_x0000_s1026" style="position:absolute;margin-left:0;margin-top:15.85pt;width:399pt;height:287.85pt;z-index:251678720;mso-position-horizontal:center;mso-position-horizontal-relative:margin" coordsize="50673,36553" o:gfxdata="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">
+                    <v:shapetype id="_x0000_t75" coordsize="21600,21600" o:spt="75" o:preferrelative="t" path="m@4@5l@4@11@9@11@9@5xe" filled="f" stroked="f">
+                      <v:stroke joinstyle="miter"/>
+                      <v:formulas>
+                        <v:f eqn="if lineDrawn pixelLineWidth 0"/>
+                        <v:f eqn="sum @0 1 0"/>
+                        <v:f eqn="sum 0 0 @1"/>
+                        <v:f eqn="prod @2 1 2"/>
+                        <v:f eqn="prod @3 21600 pixelWidth"/>
+                        <v:f eqn="prod @3 21600 pixelHeight"/>
+                        <v:f eqn="sum @0 0 1"/>
+                        <v:f eqn="prod @6 1 2"/>
+                        <v:f eqn="prod @7 21600 pixelWidth"/>
+                        <v:f eqn="sum @8 21600 0"/>
+                        <v:f eqn="prod @7 21600 pixelHeight"/>
+                        <v:f eqn="sum @10 21600 0"/>
+                      </v:formulas>
+                      <v:path o:extrusionok="f" gradientshapeok="t" o:connecttype="rect"/>
+                      <o:lock v:ext="edit" aspectratio="t"/>
+                    </v:shapetype>
+                    <v:shape id="Picture 7" o:spid="_x0000_s1027" type="#_x0000_t75" style="position:absolute;width:50673;height:24701;visibility:visible;mso-wrap-style:square" o:gfxdata="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">
+                      <v:imagedata r:id="rId18" o:title="" croptop="626f"/>
+                    </v:shape>
+                    <v:shape id="Picture 8" o:spid="_x0000_s1028" type="#_x0000_t75" style="position:absolute;top:23193;width:50666;height:13360;visibility:visible;mso-wrap-style:square" o:gfxdata="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">
+                      <v:imagedata r:id="rId19" o:title=""/>
+                    </v:shape>
+                    <w10:wrap type="topAndBottom" anchorx="margin"/>
+                  </v:group>
+                </w:pict>
+              </mc:Fallback>
+            </mc:AlternateContent>
+          </w:r>
+        </w:p>
+        <w:p/>
+        <w:p>
+          <w:pPr>
+            <w:pStyle w:val="Heading2"/>
+          </w:pPr>
+          <w:bookmarkStart w:id="12" w:name="_Toc229437731"/>
+          <w:r>
+            <w:t>4.</w:t>
+          </w:r>
+          <w:r>
+            <w:t>2</w:t>
+          </w:r>
+          <w:r>
+            <w:t xml:space="preserve">. </w:t>
+          </w:r>
+          <w:r>
+            <w:t>R</w:t>
+          </w:r>
+          <w:r>
+            <w:t xml:space="preserve">EST </w:t>
+          </w:r>
+          <w:r>
+            <w:t>API a klient pro ČSSZ</w:t>
+          </w:r>
+          <w:bookmarkEnd w:id="12"/>
+        </w:p>
+        <w:p>
+          <w:r>
+            <w:t xml:space="preserve">Bylo vytvořeno </w:t>
+          </w:r>
+          <w:r>
+            <w:t>R</w:t>
+          </w:r>
+          <w:r>
+            <w:t xml:space="preserve">EST </w:t>
+          </w:r>
+          <w:r>
+            <w:t xml:space="preserve">API poskytující externí přístup k aktivním neschopenkách teoreticky použitelné pro Českou správu sociálního zabezpečení. </w:t>
+          </w:r>
+          <w:r>
+            <w:t xml:space="preserve"> API je dostupné na adrese </w:t>
+          </w:r>
+          <w:hyperlink r:id="rId20" w:history="1">
+            <w:r>
+              <w:rPr>
+                <w:rStyle w:val="Hyperlink"/>
+              </w:rPr>
+              <w:t>http://localhost:8888/api/</w:t>
+            </w:r>
+            <w:r>
+              <w:rPr>
+                <w:rStyle w:val="Hyperlink"/>
+              </w:rPr>
+              <w:t>api</w:t>
+            </w:r>
+            <w:r>
+              <w:rPr>
+                <w:rStyle w:val="Hyperlink"/>
+              </w:rPr>
+              <w:t>.php</w:t>
+            </w:r>
+          </w:hyperlink>
+          <w:r>
+            <w:t xml:space="preserve"> a </w:t>
+          </w:r>
+          <w:r>
+            <w:t>vrací data ve standardizovaném formátu JSON</w:t>
+          </w:r>
+          <w:r>
+            <w:t xml:space="preserve">. </w:t>
+          </w:r>
+          <w:r>
+            <w:t>K R</w:t>
+          </w:r>
+          <w:r>
+            <w:t>EST</w:t>
+          </w:r>
+          <w:r>
+            <w:t xml:space="preserve"> API byl dále vytvořen vzorový klient</w:t>
+          </w:r>
+          <w:r>
+            <w:t xml:space="preserve"> v</w:t>
+          </w:r>
+          <w:r>
+            <w:t>yužív</w:t>
+          </w:r>
+          <w:r>
+            <w:t>ající</w:t>
+          </w:r>
+          <w:r>
+            <w:t xml:space="preserve"> asynchronní volání API</w:t>
+          </w:r>
+          <w:r>
+            <w:t xml:space="preserve"> a</w:t>
+          </w:r>
+          <w:r>
+            <w:t xml:space="preserve"> simulující použití v rámci informačního systému sociální správy.</w:t>
+          </w:r>
+          <w:r>
+            <w:t xml:space="preserve"> Klient je přístupný z adresy </w:t>
+          </w:r>
+          <w:hyperlink r:id="rId21" w:history="1">
+            <w:r>
+              <w:rPr>
+                <w:rStyle w:val="Hyperlink"/>
+              </w:rPr>
+              <w:t>http://localhost:8888/api/client.php</w:t>
+            </w:r>
+          </w:hyperlink>
+          <w:r>
+            <w:t>.</w:t>
+          </w:r>
+          <w:r>
+            <w:t xml:space="preserve"> Z API je možno získat prostřednictvím metody GET jak </w:t>
+          </w:r>
+          <w:r>
+            <w:lastRenderedPageBreak/>
+            <w:t xml:space="preserve">seznam aktivních neschopenek všech pacientů, tak informaci o aktivní neschopence </w:t>
+          </w:r>
+          <w:r>
+            <w:rPr>
+              <w:noProof/>
+            </w:rPr>
+            <w:drawing>
+              <wp:anchor distT="0" distB="0" distL="114300" distR="114300" simplePos="0" relativeHeight="251683840" behindDoc="0" locked="0" layoutInCell="1" allowOverlap="1" wp14:anchorId="3F60BBCC" wp14:editId="66AF0003">
+                <wp:simplePos x="0" y="0"/>
+                <wp:positionH relativeFrom="margin">
+                  <wp:align>center</wp:align>
+                </wp:positionH>
+                <wp:positionV relativeFrom="paragraph">
+                  <wp:posOffset>604520</wp:posOffset>
+                </wp:positionV>
+                <wp:extent cx="2774315" cy="2124075"/>
+                <wp:effectExtent l="0" t="0" r="6985" b="9525"/>
+                <wp:wrapTopAndBottom/>
+                <wp:docPr id="1017919558" name="Picture 11"/>
+                <wp:cNvGraphicFramePr>
+                  <a:graphicFrameLocks xmlns:a="http://schemas.openxmlformats.org/drawingml/2006/main" noChangeAspect="1"/>
+                </wp:cNvGraphicFramePr>
+                <a:graphic xmlns:a="http://schemas.openxmlformats.org/drawingml/2006/main">
+                  <a:graphicData uri="http://schemas.openxmlformats.org/drawingml/2006/picture">
+                    <pic:pic xmlns:pic="http://schemas.openxmlformats.org/drawingml/2006/picture">
+                      <pic:nvPicPr>
+                        <pic:cNvPr id="1017919558" name="Picture 1017919558"/>
+                        <pic:cNvPicPr/>
+                      </pic:nvPicPr>
+                      <pic:blipFill rotWithShape="1">
+                        <a:blip r:embed="rId22" cstate="print">
+                          <a:extLst>
+                            <a:ext uri="{28A0092B-C50C-407E-A947-70E740481C1C}">
+                              <a14:useLocalDpi xmlns:a14="http://schemas.microsoft.com/office/drawing/2010/main" val="0"/>
+                            </a:ext>
+                          </a:extLst>
+                        </a:blip>
+                        <a:srcRect l="23270" t="1006" r="23876" b="17393"/>
+                        <a:stretch>
+                          <a:fillRect/>
+                        </a:stretch>
+                      </pic:blipFill>
+                      <pic:spPr bwMode="auto">
+                        <a:xfrm>
+                          <a:off x="0" y="0"/>
+                          <a:ext cx="2774315" cy="2124075"/>
+                        </a:xfrm>
+                        <a:prstGeom prst="rect">
+                          <a:avLst/>
+                        </a:prstGeom>
+                        <a:ln>
+                          <a:noFill/>
+                        </a:ln>
+                        <a:extLst>
+                          <a:ext uri="{53640926-AAD7-44D8-BBD7-CCE9431645EC}">
+                            <a14:shadowObscured xmlns:a14="http://schemas.microsoft.com/office/drawing/2010/main"/>
+                          </a:ext>
+                        </a:extLst>
+                      </pic:spPr>
+                    </pic:pic>
+                  </a:graphicData>
+                </a:graphic>
+                <wp14:sizeRelH relativeFrom="margin">
+                  <wp14:pctWidth>0</wp14:pctWidth>
+                </wp14:sizeRelH>
+                <wp14:sizeRelV relativeFrom="margin">
+                  <wp14:pctHeight>0</wp14:pctHeight>
+                </wp14:sizeRelV>
+              </wp:anchor>
+            </w:drawing>
+          </w:r>
+          <w:r>
+            <w:rPr>
+              <w:noProof/>
+            </w:rPr>
+            <mc:AlternateContent>
+              <mc:Choice Requires="wps">
+                <w:drawing>
+                  <wp:anchor distT="0" distB="0" distL="114300" distR="114300" simplePos="0" relativeHeight="251684864" behindDoc="0" locked="0" layoutInCell="1" allowOverlap="1" wp14:anchorId="235B107B" wp14:editId="652BAE58">
+                    <wp:simplePos x="0" y="0"/>
+                    <wp:positionH relativeFrom="margin">
+                      <wp:align>center</wp:align>
+                    </wp:positionH>
+                    <wp:positionV relativeFrom="paragraph">
+                      <wp:posOffset>2785745</wp:posOffset>
+                    </wp:positionV>
+                    <wp:extent cx="2790825" cy="247650"/>
+                    <wp:effectExtent l="0" t="0" r="9525" b="0"/>
+                    <wp:wrapTopAndBottom/>
+                    <wp:docPr id="1179628965" name="Text Box 1"/>
+                    <wp:cNvGraphicFramePr/>
+                    <a:graphic xmlns:a="http://schemas.openxmlformats.org/drawingml/2006/main">
+                      <a:graphicData uri="http://schemas.microsoft.com/office/word/2010/wordprocessingShape">
+                        <wps:wsp>
+                          <wps:cNvSpPr txBox="1"/>
+                          <wps:spPr>
+                            <a:xfrm>
+                              <a:off x="0" y="0"/>
+                              <a:ext cx="2790825" cy="247650"/>
+                            </a:xfrm>
+                            <a:prstGeom prst="rect">
+                              <a:avLst/>
+                            </a:prstGeom>
+                            <a:solidFill>
+                              <a:prstClr val="white"/>
+                            </a:solidFill>
+                            <a:ln>
+                              <a:noFill/>
+                            </a:ln>
+                          </wps:spPr>
+                          <wps:txbx>
+                            <w:txbxContent>
+                              <w:p>
+                                <w:pPr>
+                                  <w:pStyle w:val="Caption"/>
+                                  <w:rPr>
+                                    <w:noProof/>
+                                  </w:rPr>
+                                </w:pPr>
+                                <w:r>
+                                  <w:t xml:space="preserve">Obrázek </w:t>
+                                </w:r>
+                                <w:r>
+                                  <w:fldChar w:fldCharType="begin"/>
+                                </w:r>
+                                <w:r>
+                                  <w:instrText xml:space="preserve"> SEQ Obrázek \* ARABIC </w:instrText>
+                                </w:r>
+                                <w:r>
+                                  <w:fldChar w:fldCharType="separate"/>
+                                </w:r>
+                                <w:r>
+                                  <w:rPr>
+                                    <w:noProof/>
+                                  </w:rPr>
+                                  <w:t>9</w:t>
+                                </w:r>
+                                <w:r>
+                                  <w:fldChar w:fldCharType="end"/>
+                                </w:r>
+                                <w:r>
+                                  <w:t>: Snímek vzorového klienta</w:t>
+                                </w:r>
+                              </w:p>
+                            </w:txbxContent>
+                          </wps:txbx>
+                          <wps:bodyPr rot="0" spcFirstLastPara="0" vertOverflow="overflow" horzOverflow="overflow" vert="horz" wrap="square" lIns="0" tIns="0" rIns="0" bIns="0" numCol="1" spcCol="0" rtlCol="0" fromWordArt="0" anchor="t" anchorCtr="0" forceAA="0" compatLnSpc="1">
+                            <a:prstTxWarp prst="textNoShape">
+                              <a:avLst/>
+                            </a:prstTxWarp>
+                            <a:noAutofit/>
+                          </wps:bodyPr>
+                        </wps:wsp>
+                      </a:graphicData>
+                    </a:graphic>
+                    <wp14:sizeRelH relativeFrom="margin">
+                      <wp14:pctWidth>0</wp14:pctWidth>
+                    </wp14:sizeRelH>
+                    <wp14:sizeRelV relativeFrom="margin">
+                      <wp14:pctHeight>0</wp14:pctHeight>
+                    </wp14:sizeRelV>
+                  </wp:anchor>
+                </w:drawing>
+              </mc:Choice>
+              <mc:Fallback>
+                <w:pict>
+                  <v:shape w14:anchorId="235B107B" id="_x0000_s1034" type="#_x0000_t202" style="position:absolute;left:0;text-align:left;margin-left:0;margin-top:219.35pt;width:219.75pt;height:19.5pt;z-index:251684864;visibility:visible;mso-wrap-style:square;mso-width-percent:0;mso-height-percent:0;mso-wrap-distance-left:9pt;mso-wrap-distance-top:0;mso-wrap-distance-right:9pt;mso-wrap-distance-bottom:0;mso-position-horizontal:center;mso-position-horizontal-relative:margin;mso-position-vertical:absolute;mso-position-vertical-relative:text;mso-width-percent:0;mso-height-percent:0;mso-width-relative:margin;mso-height-relative:margin;v-text-anchor:top" o:gfxdata="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" stroked="f">
+                    <v:textbox inset="0,0,0,0">
+                      <w:txbxContent>
+                        <w:p>
+                          <w:pPr>
+                            <w:pStyle w:val="Caption"/>
+                            <w:rPr>
+                              <w:noProof/>
+                            </w:rPr>
+                          </w:pPr>
+                          <w:r>
+                            <w:t xml:space="preserve">Obrázek </w:t>
+                          </w:r>
+                          <w:r>
+                            <w:fldChar w:fldCharType="begin"/>
+                          </w:r>
+                          <w:r>
+                            <w:instrText xml:space="preserve"> SEQ Obrázek \* ARABIC </w:instrText>
+                          </w:r>
+                          <w:r>
+                            <w:fldChar w:fldCharType="separate"/>
+                          </w:r>
+                          <w:r>
+                            <w:rPr>
+                              <w:noProof/>
+                            </w:rPr>
+                            <w:t>9</w:t>
+                          </w:r>
+                          <w:r>
+                            <w:fldChar w:fldCharType="end"/>
+                          </w:r>
+                          <w:r>
+                            <w:t>: Snímek vzorového klienta</w:t>
+                          </w:r>
+                        </w:p>
+                      </w:txbxContent>
+                    </v:textbox>
+                    <w10:wrap type="topAndBottom" anchorx="margin"/>
+                  </v:shape>
+                </w:pict>
+              </mc:Fallback>
+            </mc:AlternateContent>
+          </w:r>
+          <w:r>
+            <w:t>konkrétního pacienta.</w:t>
+          </w:r>
+        </w:p>
+        <w:p/>
+        <w:p>
+          <w:pPr>
+            <w:pStyle w:val="Heading2"/>
+          </w:pPr>
+          <w:bookmarkStart w:id="13" w:name="_Toc229437732"/>
+          <w:r>
+            <w:t>4.</w:t>
+          </w:r>
+          <w:r>
+            <w:t>3</w:t>
+          </w:r>
+          <w:r>
+            <w:t>. Prostor pro rozšíření</w:t>
+          </w:r>
+          <w:bookmarkEnd w:id="13"/>
+        </w:p>
+        <w:p>
+          <w:r>
+            <w:t xml:space="preserve">Pro lepší </w:t>
+          </w:r>
+          <w:r>
+            <w:t>využitel</w:t>
+          </w:r>
+          <w:r>
+            <w:t xml:space="preserve">nost aplikace ve skutečném chodu chirurgické aplikace by mohli být doimplementování části aplikace pro správu </w:t>
+          </w:r>
+          <w:r>
+            <w:t xml:space="preserve">interakcí léčiv a zobrazení aktivních neschopenek přímo ve vlastní aplikaci. Aplikace by též mohla být napojena na </w:t>
+          </w:r>
+          <w:r>
+            <w:t>centrální registr pojišťoven, či na službu s přístupem k</w:t>
+          </w:r>
+          <w:r>
+            <w:t xml:space="preserve"> standardizovaným seznam</w:t>
+          </w:r>
+          <w:r>
+            <w:t>ům</w:t>
+          </w:r>
+          <w:r>
+            <w:t xml:space="preserve"> léčiv a diagnóz včetně jejich diagnostických kódů</w:t>
+          </w:r>
+          <w:r>
+            <w:t>. Pro možnost nasazení do reálného provozu by musel být přístup do aplikace omezen přístupovými údaji. Aplikace by mohla být škálována pro činnost více lékařů v ordinaci například pro případ zástupu.</w:t>
+          </w:r>
+        </w:p>
+        <w:p>
+          <w:pPr>
+            <w:pStyle w:val="Heading1"/>
+            <w:numPr>
+              <w:ilvl w:val="0"/>
+              <w:numId w:val="1"/>
+            </w:numPr>
+          </w:pPr>
+          <w:r>
+            <w:t xml:space="preserve"> </w:t>
+          </w:r>
+          <w:bookmarkStart w:id="14" w:name="_Toc229437733"/>
+          <w:r>
+            <w:t>Upozornění</w:t>
+          </w:r>
+          <w:bookmarkEnd w:id="14"/>
+        </w:p>
+        <w:p>
+          <w:r>
+            <w:t>Veškerá data pacientů jsou pouze vzorová a jakákoliv podobnost s reálnými osobami je zcela náhodná.</w:t>
           </w:r>
         </w:p>
         <w:p/>
@@ -1275,9 +4315,9 @@
     </w:sdt>
     <w:p/>
     <w:sectPr>
-      <w:headerReference w:type="default" r:id="rId11"/>
-      <w:footerReference w:type="default" r:id="rId12"/>
-      <w:headerReference w:type="first" r:id="rId13"/>
+      <w:headerReference w:type="default" r:id="rId23"/>
+      <w:footerReference w:type="default" r:id="rId24"/>
+      <w:headerReference w:type="first" r:id="rId25"/>
       <w:pgSz w:w="11906" w:h="16838"/>
       <w:pgMar w:top="1440" w:right="1440" w:bottom="1440" w:left="1440" w:header="708" w:footer="708" w:gutter="0"/>
       <w:pgNumType w:start="0"/>
@@ -2325,7 +5365,6 @@
   <w:style w:type="character" w:default="1" w:styleId="DefaultParagraphFont">
     <w:name w:val="Default Paragraph Font"/>
     <w:uiPriority w:val="1"/>
-    <w:semiHidden/>
     <w:unhideWhenUsed/>
   </w:style>
   <w:style w:type="table" w:default="1" w:styleId="TableNormal">
@@ -2701,6 +5740,88 @@
       <w:szCs w:val="18"/>
     </w:rPr>
   </w:style>
+  <w:style w:type="character" w:styleId="Hyperlink">
+    <w:name w:val="Hyperlink"/>
+    <w:basedOn w:val="DefaultParagraphFont"/>
+    <w:uiPriority w:val="99"/>
+    <w:unhideWhenUsed/>
+    <w:rsid w:val="006B6393"/>
+    <w:rPr>
+      <w:color w:val="467886" w:themeColor="hyperlink"/>
+      <w:u w:val="single"/>
+    </w:rPr>
+  </w:style>
+  <w:style w:type="character" w:styleId="UnresolvedMention">
+    <w:name w:val="Unresolved Mention"/>
+    <w:basedOn w:val="DefaultParagraphFont"/>
+    <w:uiPriority w:val="99"/>
+    <w:semiHidden/>
+    <w:unhideWhenUsed/>
+    <w:rsid w:val="006B6393"/>
+    <w:rPr>
+      <w:color w:val="605E5C"/>
+      <w:shd w:val="clear" w:color="auto" w:fill="E1DFDD"/>
+    </w:rPr>
+  </w:style>
+  <w:style w:type="paragraph" w:styleId="TOCHeading">
+    <w:name w:val="TOC Heading"/>
+    <w:basedOn w:val="Heading1"/>
+    <w:next w:val="Normal"/>
+    <w:uiPriority w:val="39"/>
+    <w:unhideWhenUsed/>
+    <w:qFormat/>
+    <w:rsid w:val="005E63AF"/>
+    <w:pPr>
+      <w:spacing w:before="240" w:after="0" w:line="259" w:lineRule="auto"/>
+      <w:ind w:firstLine="0"/>
+      <w:outlineLvl w:val="9"/>
+    </w:pPr>
+    <w:rPr>
+      <w:kern w:val="0"/>
+      <w:sz w:val="32"/>
+      <w:szCs w:val="32"/>
+      <w:lang w:val="en-GB" w:eastAsia="en-GB"/>
+      <w14:ligatures w14:val="none"/>
+    </w:rPr>
+  </w:style>
+  <w:style w:type="paragraph" w:styleId="TOC1">
+    <w:name w:val="toc 1"/>
+    <w:basedOn w:val="Normal"/>
+    <w:next w:val="Normal"/>
+    <w:autoRedefine/>
+    <w:uiPriority w:val="39"/>
+    <w:unhideWhenUsed/>
+    <w:rsid w:val="005E63AF"/>
+    <w:pPr>
+      <w:spacing w:after="100"/>
+    </w:pPr>
+  </w:style>
+  <w:style w:type="paragraph" w:styleId="TOC2">
+    <w:name w:val="toc 2"/>
+    <w:basedOn w:val="Normal"/>
+    <w:next w:val="Normal"/>
+    <w:autoRedefine/>
+    <w:uiPriority w:val="39"/>
+    <w:unhideWhenUsed/>
+    <w:rsid w:val="005E63AF"/>
+    <w:pPr>
+      <w:spacing w:after="100"/>
+      <w:ind w:left="240"/>
+    </w:pPr>
+  </w:style>
+  <w:style w:type="paragraph" w:styleId="TOC3">
+    <w:name w:val="toc 3"/>
+    <w:basedOn w:val="Normal"/>
+    <w:next w:val="Normal"/>
+    <w:autoRedefine/>
+    <w:uiPriority w:val="39"/>
+    <w:unhideWhenUsed/>
+    <w:rsid w:val="005E63AF"/>
+    <w:pPr>
+      <w:spacing w:after="100"/>
+      <w:ind w:left="480"/>
+    </w:pPr>
+  </w:style>
 </w:styles>
 </file>
 
@@ -2997,4 +6118,16 @@
     </a:ext>
   </a:extLst>
 </a:theme>
+</file>
+
+<file path=customXml/item1.xml><?xml version="1.0" encoding="utf-8"?>
+<b:Sources xmlns:b="http://schemas.openxmlformats.org/officeDocument/2006/bibliography" xmlns="http://schemas.openxmlformats.org/officeDocument/2006/bibliography" SelectedStyle="\APASixthEditionOfficeOnline.xsl" StyleName="APA" Version="6"/>
+</file>
+
+<file path=customXml/itemProps1.xml><?xml version="1.0" encoding="utf-8"?>
+<ds:datastoreItem xmlns:ds="http://schemas.openxmlformats.org/officeDocument/2006/customXml" ds:itemID="{89001391-7025-47CD-B458-3A043D9DB831}">
+  <ds:schemaRefs>
+    <ds:schemaRef ds:uri="http://schemas.openxmlformats.org/officeDocument/2006/bibliography"/>
+  </ds:schemaRefs>
+</ds:datastoreItem>
 </file>
</xml_diff>